<commit_message>
docs: wrap paper tables in 1-col section to span both body columns
Previously the 4-column TABLE III broke the 2-col body flow on page 4:
the caption was separated from the data, and TABLE I's "Total classified"
row overflowed. Tables now sit in their own continuous single-column
section (IEEE "table*" pattern) sandwiched between the 2-col body
sections, so they span the full page width and the prose flows cleanly
around them.

Adds _add_full_width_table() which:
  1. inserts a CONTINUOUS section break, sets cols=1
  2. delegates to _add_table()
  3. inserts another CONTINUOUS section break, restores cols=2

All three result tables (per-class dataset, overall, per-class metrics)
now render with intact headers and data rows. Paper grows 5 -> 6 pages
because of the extra section transitions; still within the 4-6 IEEE band.
</commit_message>
<xml_diff>
--- a/papers/ieee_khpi_week_2026/ieee_khpi_week_2026.docx
+++ b/papers/ieee_khpi_week_2026/ieee_khpi_week_2026.docx
@@ -352,6 +352,17 @@
       <w:r>
         <w:t>We validate the proposed graph-based concept formation approach on the complete-structure subset of the MNIST handwritten digit dataset [18]. The experimental design emphasizes few-shot learning capability with minimal training data and interpretable graph structures, covering all 10 digit classes.</w:t>
       </w:r>
+    </w:p>
+    <w:p>
+      <w:pPr>
+        <w:sectPr>
+          <w:type w:val="continuous"/>
+          <w:pgSz w:w="11906" w:h="16838" w:code="9"/>
+          <w:pgMar w:top="1080" w:right="893" w:bottom="1440" w:left="893" w:header="720" w:footer="720" w:gutter="0"/>
+          <w:cols w:space="425" w:num="2" w:equalWidth="1"/>
+          <w:docGrid w:linePitch="360"/>
+        </w:sectPr>
+      </w:pPr>
     </w:p>
     <w:p>
       <w:pPr>
@@ -712,6 +723,17 @@
     </w:tbl>
     <w:p>
       <w:pPr>
+        <w:sectPr>
+          <w:type w:val="continuous"/>
+          <w:pgSz w:w="11906" w:h="16838" w:code="9"/>
+          <w:pgMar w:top="1080" w:right="893" w:bottom="1440" w:left="893" w:header="720" w:footer="720" w:gutter="0"/>
+          <w:cols w:space="425" w:num="1" w:equalWidth="1"/>
+          <w:docGrid w:linePitch="360"/>
+        </w:sectPr>
+      </w:pPr>
+    </w:p>
+    <w:p>
+      <w:pPr>
         <w:pStyle w:val="a3"/>
       </w:pPr>
       <w:r>
@@ -773,6 +795,17 @@
       <w:r>
         <w:t>Across 8 707 test images, the system achieves 85.80 % accuracy, 89.31 % precision, 85.80 % recall and 86.66 % F1 (Table II). The pipeline success rate reaches 99.75 %, with 22 images routed to a dead-letter queue due to skeletonization failures that produced disconnected graphs. These results demonstrate that few-shot concept formation from 2–6 training samples per concept can achieve competitive classification performance without gradient-based optimization or deep feature extraction, relying solely on explicit structural comparison.</w:t>
       </w:r>
+    </w:p>
+    <w:p>
+      <w:pPr>
+        <w:sectPr>
+          <w:type w:val="continuous"/>
+          <w:pgSz w:w="11906" w:h="16838" w:code="9"/>
+          <w:pgMar w:top="1080" w:right="893" w:bottom="1440" w:left="893" w:header="720" w:footer="720" w:gutter="0"/>
+          <w:cols w:space="425" w:num="2" w:equalWidth="1"/>
+          <w:docGrid w:linePitch="360"/>
+        </w:sectPr>
+      </w:pPr>
     </w:p>
     <w:p>
       <w:pPr>
@@ -935,6 +968,28 @@
         </w:tc>
       </w:tr>
     </w:tbl>
+    <w:p>
+      <w:pPr>
+        <w:sectPr>
+          <w:type w:val="continuous"/>
+          <w:pgSz w:w="11906" w:h="16838" w:code="9"/>
+          <w:pgMar w:top="1080" w:right="893" w:bottom="1440" w:left="893" w:header="720" w:footer="720" w:gutter="0"/>
+          <w:cols w:space="425" w:num="1" w:equalWidth="1"/>
+          <w:docGrid w:linePitch="360"/>
+        </w:sectPr>
+      </w:pPr>
+    </w:p>
+    <w:p>
+      <w:pPr>
+        <w:sectPr>
+          <w:type w:val="continuous"/>
+          <w:pgSz w:w="11906" w:h="16838" w:code="9"/>
+          <w:pgMar w:top="1080" w:right="893" w:bottom="1440" w:left="893" w:header="720" w:footer="720" w:gutter="0"/>
+          <w:cols w:space="425" w:num="2" w:equalWidth="1"/>
+          <w:docGrid w:linePitch="360"/>
+        </w:sectPr>
+      </w:pPr>
+    </w:p>
     <w:p>
       <w:pPr>
         <w:pStyle w:val="tablehead"/>
@@ -1554,6 +1609,17 @@
         </w:tc>
       </w:tr>
     </w:tbl>
+    <w:p>
+      <w:pPr>
+        <w:sectPr>
+          <w:type w:val="continuous"/>
+          <w:pgSz w:w="11906" w:h="16838" w:code="9"/>
+          <w:pgMar w:top="1080" w:right="893" w:bottom="1440" w:left="893" w:header="720" w:footer="720" w:gutter="0"/>
+          <w:cols w:space="425" w:num="1" w:equalWidth="1"/>
+          <w:docGrid w:linePitch="360"/>
+        </w:sectPr>
+      </w:pPr>
+    </w:p>
     <w:p>
       <w:pPr>
         <w:jc w:val="center"/>

</xml_diff>

<commit_message>
docs: render authors in IEEE 3-column layout
Previously the 5 co-authors stacked vertically in a single column,
which works but does not match the IEEE Conference Template's
standard layout. Now they are arranged in a 2×3 invisible-border
table (row 1: Lapin / Bokhan / Parzhyn; row 2: Perevoznyk /
Aleksandrova / empty) matching the IEEE template, with the
co-author's name in bold above department, organisation, and
city/email lines.

Adds _add_author_table() and _hide_cell_borders() helpers; the
build loop calls them once instead of iterating per-author. Page
count unchanged (6 pages).
</commit_message>
<xml_diff>
--- a/papers/ieee_khpi_week_2026/ieee_khpi_week_2026.docx
+++ b/papers/ieee_khpi_week_2026/ieee_khpi_week_2026.docx
@@ -10,76 +10,210 @@
         <w:t>Few-Shot Digit Recognition using Graph Concept Attractors</w:t>
       </w:r>
     </w:p>
-    <w:p>
-      <w:pPr>
-        <w:pStyle w:val="Author"/>
-      </w:pPr>
-      <w:r>
-        <w:t>Mykyta Lapin</w:t>
-        <w:br/>
-        <w:t>Dept. of Systems Analysis and Information-Analytical Technologies</w:t>
-        <w:br/>
-        <w:t>National Technical University "Kharkiv Polytechnic Institute"</w:t>
-        <w:br/>
-        <w:t>Kharkiv, Ukraine — Mykyta.Lapin@cit.khpi.edu.ua</w:t>
-      </w:r>
-    </w:p>
-    <w:p>
-      <w:pPr>
-        <w:pStyle w:val="Author"/>
-      </w:pPr>
-      <w:r>
-        <w:t>Kostiantyn Bokhan</w:t>
-        <w:br/>
-        <w:t>Dept. of Systems Analysis and Information-Analytical Technologies</w:t>
-        <w:br/>
-        <w:t>National Technical University "Kharkiv Polytechnic Institute"</w:t>
-        <w:br/>
-        <w:t>Kharkiv, Ukraine — kostiantyn.bokhan@khpi.edu.ua</w:t>
-      </w:r>
-    </w:p>
-    <w:p>
-      <w:pPr>
-        <w:pStyle w:val="Author"/>
-      </w:pPr>
-      <w:r>
-        <w:t>Yurii Parzhyn</w:t>
-        <w:br/>
-        <w:t>School of Computer and Cyber Sciences</w:t>
-        <w:br/>
-        <w:t>Augusta University</w:t>
-        <w:br/>
-        <w:t>Augusta, GA, USA — yparzhyn@augusta.edu</w:t>
-      </w:r>
-    </w:p>
-    <w:p>
-      <w:pPr>
-        <w:pStyle w:val="Author"/>
-      </w:pPr>
-      <w:r>
-        <w:t>Kyrylo Perevoznyk</w:t>
-        <w:br/>
-        <w:t>Dept. of Systems Analysis and Information-Analytical Technologies</w:t>
-        <w:br/>
-        <w:t>National Technical University "Kharkiv Polytechnic Institute"</w:t>
-        <w:br/>
-        <w:t>Kharkiv, Ukraine — kyrylo.perevoznyk@cs.khpi.edu.ua</w:t>
-      </w:r>
-    </w:p>
-    <w:p>
-      <w:pPr>
-        <w:pStyle w:val="Author"/>
-      </w:pPr>
-      <w:r>
-        <w:t>Tetiana Aleksandrova</w:t>
-        <w:br/>
-        <w:t>Dept. of Systems Analysis and Information-Analytical Technologies</w:t>
-        <w:br/>
-        <w:t>National Technical University "Kharkiv Polytechnic Institute"</w:t>
-        <w:br/>
-        <w:t>Kharkiv, Ukraine — Tetiana.Aleksandrova@khpi.edu.ua</w:t>
-      </w:r>
-    </w:p>
+    <w:tbl>
+      <w:tblPr>
+        <w:tblW w:type="auto" w:w="0"/>
+        <w:jc w:val="center"/>
+        <w:tblLayout w:type="autofit"/>
+        <w:tblLook w:firstColumn="1" w:firstRow="1" w:lastColumn="0" w:lastRow="0" w:noHBand="0" w:noVBand="1" w:val="04A0"/>
+      </w:tblPr>
+      <w:tblGrid>
+        <w:gridCol w:w="3373"/>
+        <w:gridCol w:w="3373"/>
+        <w:gridCol w:w="3373"/>
+      </w:tblGrid>
+      <w:tr>
+        <w:tc>
+          <w:tcPr>
+            <w:tcW w:type="dxa" w:w="3373"/>
+            <w:tcBorders>
+              <w:top w:val="nil"/>
+              <w:left w:val="nil"/>
+              <w:bottom w:val="nil"/>
+              <w:right w:val="nil"/>
+            </w:tcBorders>
+          </w:tcPr>
+          <w:p>
+            <w:pPr>
+              <w:pStyle w:val="Author"/>
+              <w:jc w:val="center"/>
+            </w:pPr>
+            <w:r>
+              <w:rPr>
+                <w:b/>
+              </w:rPr>
+              <w:t>Mykyta Lapin</w:t>
+              <w:br/>
+            </w:r>
+            <w:r>
+              <w:t>Dept. of Systems Analysis and Information-Analytical Technologies</w:t>
+              <w:br/>
+            </w:r>
+            <w:r>
+              <w:t>National Technical University "Kharkiv Polytechnic Institute"</w:t>
+              <w:br/>
+            </w:r>
+            <w:r>
+              <w:t>Kharkiv, Ukraine — Mykyta.Lapin@cit.khpi.edu.ua</w:t>
+            </w:r>
+          </w:p>
+        </w:tc>
+        <w:tc>
+          <w:tcPr>
+            <w:tcW w:type="dxa" w:w="3373"/>
+            <w:tcBorders>
+              <w:top w:val="nil"/>
+              <w:left w:val="nil"/>
+              <w:bottom w:val="nil"/>
+              <w:right w:val="nil"/>
+            </w:tcBorders>
+          </w:tcPr>
+          <w:p>
+            <w:pPr>
+              <w:pStyle w:val="Author"/>
+              <w:jc w:val="center"/>
+            </w:pPr>
+            <w:r>
+              <w:rPr>
+                <w:b/>
+              </w:rPr>
+              <w:t>Kostiantyn Bokhan</w:t>
+              <w:br/>
+            </w:r>
+            <w:r>
+              <w:t>Dept. of Systems Analysis and Information-Analytical Technologies</w:t>
+              <w:br/>
+            </w:r>
+            <w:r>
+              <w:t>National Technical University "Kharkiv Polytechnic Institute"</w:t>
+              <w:br/>
+            </w:r>
+            <w:r>
+              <w:t>Kharkiv, Ukraine — kostiantyn.bokhan@khpi.edu.ua</w:t>
+            </w:r>
+          </w:p>
+        </w:tc>
+        <w:tc>
+          <w:tcPr>
+            <w:tcW w:type="dxa" w:w="3373"/>
+            <w:tcBorders>
+              <w:top w:val="nil"/>
+              <w:left w:val="nil"/>
+              <w:bottom w:val="nil"/>
+              <w:right w:val="nil"/>
+            </w:tcBorders>
+          </w:tcPr>
+          <w:p>
+            <w:pPr>
+              <w:pStyle w:val="Author"/>
+              <w:jc w:val="center"/>
+            </w:pPr>
+            <w:r>
+              <w:rPr>
+                <w:b/>
+              </w:rPr>
+              <w:t>Yurii Parzhyn</w:t>
+              <w:br/>
+            </w:r>
+            <w:r>
+              <w:t>School of Computer and Cyber Sciences</w:t>
+              <w:br/>
+            </w:r>
+            <w:r>
+              <w:t>Augusta University</w:t>
+              <w:br/>
+            </w:r>
+            <w:r>
+              <w:t>Augusta, GA, USA — yparzhyn@augusta.edu</w:t>
+            </w:r>
+          </w:p>
+        </w:tc>
+      </w:tr>
+      <w:tr>
+        <w:tc>
+          <w:tcPr>
+            <w:tcW w:type="dxa" w:w="3373"/>
+            <w:tcBorders>
+              <w:top w:val="nil"/>
+              <w:left w:val="nil"/>
+              <w:bottom w:val="nil"/>
+              <w:right w:val="nil"/>
+            </w:tcBorders>
+          </w:tcPr>
+          <w:p>
+            <w:pPr>
+              <w:pStyle w:val="Author"/>
+              <w:jc w:val="center"/>
+            </w:pPr>
+            <w:r>
+              <w:rPr>
+                <w:b/>
+              </w:rPr>
+              <w:t>Kyrylo Perevoznyk</w:t>
+              <w:br/>
+            </w:r>
+            <w:r>
+              <w:t>Dept. of Systems Analysis and Information-Analytical Technologies</w:t>
+              <w:br/>
+            </w:r>
+            <w:r>
+              <w:t>National Technical University "Kharkiv Polytechnic Institute"</w:t>
+              <w:br/>
+            </w:r>
+            <w:r>
+              <w:t>Kharkiv, Ukraine — kyrylo.perevoznyk@cs.khpi.edu.ua</w:t>
+            </w:r>
+          </w:p>
+        </w:tc>
+        <w:tc>
+          <w:tcPr>
+            <w:tcW w:type="dxa" w:w="3373"/>
+            <w:tcBorders>
+              <w:top w:val="nil"/>
+              <w:left w:val="nil"/>
+              <w:bottom w:val="nil"/>
+              <w:right w:val="nil"/>
+            </w:tcBorders>
+          </w:tcPr>
+          <w:p>
+            <w:pPr>
+              <w:pStyle w:val="Author"/>
+              <w:jc w:val="center"/>
+            </w:pPr>
+            <w:r>
+              <w:rPr>
+                <w:b/>
+              </w:rPr>
+              <w:t>Tetiana Aleksandrova</w:t>
+              <w:br/>
+            </w:r>
+            <w:r>
+              <w:t>Dept. of Systems Analysis and Information-Analytical Technologies</w:t>
+              <w:br/>
+            </w:r>
+            <w:r>
+              <w:t>National Technical University "Kharkiv Polytechnic Institute"</w:t>
+              <w:br/>
+            </w:r>
+            <w:r>
+              <w:t>Kharkiv, Ukraine — Tetiana.Aleksandrova@khpi.edu.ua</w:t>
+            </w:r>
+          </w:p>
+        </w:tc>
+        <w:tc>
+          <w:tcPr>
+            <w:tcW w:type="dxa" w:w="3373"/>
+            <w:tcBorders>
+              <w:top w:val="nil"/>
+              <w:left w:val="nil"/>
+              <w:bottom w:val="nil"/>
+              <w:right w:val="nil"/>
+            </w:tcBorders>
+          </w:tcPr>
+          <w:p/>
+        </w:tc>
+      </w:tr>
+    </w:tbl>
     <w:p>
       <w:pPr>
         <w:pStyle w:val="Abstract"/>

</xml_diff>

<commit_message>
docs: align KhPIWeek paper with IEEE template
Rename title to "Explainable AI for Few-Shot Digit Recognition" so
the XAI contribution leads. Rebuild section topology to match the
KhPIWeek template exactly: 1-col title section with first-page IEEE
header and copyright footer (979-8-3315-5236-7), two 3-col author
bands with column breaks per row, and a 2-col body with
template-faithful margins (893/907 twips) and column gap (360 twips).
Switch References to the template's lowercase 'references' style
(auto-numbered [N], hanging indent, 8pt justified) and use Heading 5
for the unnumbered heading.
</commit_message>
<xml_diff>
--- a/papers/ieee_khpi_week_2026/ieee_khpi_week_2026.docx
+++ b/papers/ieee_khpi_week_2026/ieee_khpi_week_2026.docx
@@ -7,213 +7,202 @@
         <w:pStyle w:val="papertitle"/>
       </w:pPr>
       <w:r>
-        <w:t>Few-Shot Digit Recognition using Graph Concept Attractors</w:t>
-      </w:r>
-    </w:p>
-    <w:tbl>
-      <w:tblPr>
-        <w:tblW w:type="auto" w:w="0"/>
+        <w:t>Explainable AI for Few-Shot Digit Recognition</w:t>
+      </w:r>
+    </w:p>
+    <w:p>
+      <w:pPr>
+        <w:sectPr>
+          <w:headerReference w:type="first" r:id="rId17"/>
+          <w:footerReference w:type="first" r:id="rId18"/>
+          <w:type w:val="continuous"/>
+          <w:pgSz w:w="11906" w:h="16838" w:code="9"/>
+          <w:pgMar w:top="540" w:right="893" w:bottom="1440" w:left="893" w:header="255" w:footer="1020" w:gutter="0"/>
+          <w:cols w:space="720"/>
+          <w:titlePg/>
+          <w:docGrid w:linePitch="360"/>
+        </w:sectPr>
+      </w:pPr>
+    </w:p>
+    <w:p>
+      <w:pPr>
+        <w:pStyle w:val="Author"/>
+        <w:spacing w:before="0"/>
         <w:jc w:val="center"/>
-        <w:tblLayout w:type="autofit"/>
-        <w:tblLook w:firstColumn="1" w:firstRow="1" w:lastColumn="0" w:lastRow="0" w:noHBand="0" w:noVBand="1" w:val="04A0"/>
-      </w:tblPr>
-      <w:tblGrid>
-        <w:gridCol w:w="3373"/>
-        <w:gridCol w:w="3373"/>
-        <w:gridCol w:w="3373"/>
-      </w:tblGrid>
-      <w:tr>
-        <w:tc>
-          <w:tcPr>
-            <w:tcW w:type="dxa" w:w="3373"/>
-            <w:tcBorders>
-              <w:top w:val="nil"/>
-              <w:left w:val="nil"/>
-              <w:bottom w:val="nil"/>
-              <w:right w:val="nil"/>
-            </w:tcBorders>
-          </w:tcPr>
-          <w:p>
-            <w:pPr>
-              <w:pStyle w:val="Author"/>
-              <w:jc w:val="center"/>
-            </w:pPr>
-            <w:r>
-              <w:rPr>
-                <w:b/>
-              </w:rPr>
-              <w:t>Mykyta Lapin</w:t>
-              <w:br/>
-            </w:r>
-            <w:r>
-              <w:t>Dept. of Systems Analysis and Information-Analytical Technologies</w:t>
-              <w:br/>
-            </w:r>
-            <w:r>
-              <w:t>National Technical University "Kharkiv Polytechnic Institute"</w:t>
-              <w:br/>
-            </w:r>
-            <w:r>
-              <w:t>Kharkiv, Ukraine — Mykyta.Lapin@cit.khpi.edu.ua</w:t>
-            </w:r>
-          </w:p>
-        </w:tc>
-        <w:tc>
-          <w:tcPr>
-            <w:tcW w:type="dxa" w:w="3373"/>
-            <w:tcBorders>
-              <w:top w:val="nil"/>
-              <w:left w:val="nil"/>
-              <w:bottom w:val="nil"/>
-              <w:right w:val="nil"/>
-            </w:tcBorders>
-          </w:tcPr>
-          <w:p>
-            <w:pPr>
-              <w:pStyle w:val="Author"/>
-              <w:jc w:val="center"/>
-            </w:pPr>
-            <w:r>
-              <w:rPr>
-                <w:b/>
-              </w:rPr>
-              <w:t>Kostiantyn Bokhan</w:t>
-              <w:br/>
-            </w:r>
-            <w:r>
-              <w:t>Dept. of Systems Analysis and Information-Analytical Technologies</w:t>
-              <w:br/>
-            </w:r>
-            <w:r>
-              <w:t>National Technical University "Kharkiv Polytechnic Institute"</w:t>
-              <w:br/>
-            </w:r>
-            <w:r>
-              <w:t>Kharkiv, Ukraine — kostiantyn.bokhan@khpi.edu.ua</w:t>
-            </w:r>
-          </w:p>
-        </w:tc>
-        <w:tc>
-          <w:tcPr>
-            <w:tcW w:type="dxa" w:w="3373"/>
-            <w:tcBorders>
-              <w:top w:val="nil"/>
-              <w:left w:val="nil"/>
-              <w:bottom w:val="nil"/>
-              <w:right w:val="nil"/>
-            </w:tcBorders>
-          </w:tcPr>
-          <w:p>
-            <w:pPr>
-              <w:pStyle w:val="Author"/>
-              <w:jc w:val="center"/>
-            </w:pPr>
-            <w:r>
-              <w:rPr>
-                <w:b/>
-              </w:rPr>
-              <w:t>Yurii Parzhyn</w:t>
-              <w:br/>
-            </w:r>
-            <w:r>
-              <w:t>School of Computer and Cyber Sciences</w:t>
-              <w:br/>
-            </w:r>
-            <w:r>
-              <w:t>Augusta University</w:t>
-              <w:br/>
-            </w:r>
-            <w:r>
-              <w:t>Augusta, GA, USA — yparzhyn@augusta.edu</w:t>
-            </w:r>
-          </w:p>
-        </w:tc>
-      </w:tr>
-      <w:tr>
-        <w:tc>
-          <w:tcPr>
-            <w:tcW w:type="dxa" w:w="3373"/>
-            <w:tcBorders>
-              <w:top w:val="nil"/>
-              <w:left w:val="nil"/>
-              <w:bottom w:val="nil"/>
-              <w:right w:val="nil"/>
-            </w:tcBorders>
-          </w:tcPr>
-          <w:p>
-            <w:pPr>
-              <w:pStyle w:val="Author"/>
-              <w:jc w:val="center"/>
-            </w:pPr>
-            <w:r>
-              <w:rPr>
-                <w:b/>
-              </w:rPr>
-              <w:t>Kyrylo Perevoznyk</w:t>
-              <w:br/>
-            </w:r>
-            <w:r>
-              <w:t>Dept. of Systems Analysis and Information-Analytical Technologies</w:t>
-              <w:br/>
-            </w:r>
-            <w:r>
-              <w:t>National Technical University "Kharkiv Polytechnic Institute"</w:t>
-              <w:br/>
-            </w:r>
-            <w:r>
-              <w:t>Kharkiv, Ukraine — kyrylo.perevoznyk@cs.khpi.edu.ua</w:t>
-            </w:r>
-          </w:p>
-        </w:tc>
-        <w:tc>
-          <w:tcPr>
-            <w:tcW w:type="dxa" w:w="3373"/>
-            <w:tcBorders>
-              <w:top w:val="nil"/>
-              <w:left w:val="nil"/>
-              <w:bottom w:val="nil"/>
-              <w:right w:val="nil"/>
-            </w:tcBorders>
-          </w:tcPr>
-          <w:p>
-            <w:pPr>
-              <w:pStyle w:val="Author"/>
-              <w:jc w:val="center"/>
-            </w:pPr>
-            <w:r>
-              <w:rPr>
-                <w:b/>
-              </w:rPr>
-              <w:t>Tetiana Aleksandrova</w:t>
-              <w:br/>
-            </w:r>
-            <w:r>
-              <w:t>Dept. of Systems Analysis and Information-Analytical Technologies</w:t>
-              <w:br/>
-            </w:r>
-            <w:r>
-              <w:t>National Technical University "Kharkiv Polytechnic Institute"</w:t>
-              <w:br/>
-            </w:r>
-            <w:r>
-              <w:t>Kharkiv, Ukraine — Tetiana.Aleksandrova@khpi.edu.ua</w:t>
-            </w:r>
-          </w:p>
-        </w:tc>
-        <w:tc>
-          <w:tcPr>
-            <w:tcW w:type="dxa" w:w="3373"/>
-            <w:tcBorders>
-              <w:top w:val="nil"/>
-              <w:left w:val="nil"/>
-              <w:bottom w:val="nil"/>
-              <w:right w:val="nil"/>
-            </w:tcBorders>
-          </w:tcPr>
-          <w:p/>
-        </w:tc>
-      </w:tr>
-    </w:tbl>
+      </w:pPr>
+      <w:r>
+        <w:rPr>
+          <w:b/>
+        </w:rPr>
+        <w:t>Mykyta Lapin</w:t>
+        <w:br/>
+      </w:r>
+      <w:r>
+        <w:t>Dept. of Systems Analysis and Information-Analytical Technologies</w:t>
+        <w:br/>
+      </w:r>
+      <w:r>
+        <w:t>National Technical University "Kharkiv Polytechnic Institute"</w:t>
+        <w:br/>
+      </w:r>
+      <w:r>
+        <w:t>Kharkiv, Ukraine</w:t>
+        <w:br/>
+      </w:r>
+      <w:r>
+        <w:t>Mykyta.Lapin@cit.khpi.edu.ua</w:t>
+      </w:r>
+      <w:r>
+        <w:br w:type="column"/>
+      </w:r>
+    </w:p>
+    <w:p>
+      <w:pPr>
+        <w:pStyle w:val="Author"/>
+        <w:spacing w:before="0"/>
+        <w:jc w:val="center"/>
+      </w:pPr>
+      <w:r>
+        <w:rPr>
+          <w:b/>
+        </w:rPr>
+        <w:t>Kostiantyn Bokhan</w:t>
+        <w:br/>
+      </w:r>
+      <w:r>
+        <w:t>Dept. of Systems Analysis and Information-Analytical Technologies</w:t>
+        <w:br/>
+      </w:r>
+      <w:r>
+        <w:t>National Technical University "Kharkiv Polytechnic Institute"</w:t>
+        <w:br/>
+      </w:r>
+      <w:r>
+        <w:t>Kharkiv, Ukraine</w:t>
+        <w:br/>
+      </w:r>
+      <w:r>
+        <w:t>kostiantyn.bokhan@khpi.edu.ua</w:t>
+      </w:r>
+      <w:r>
+        <w:br w:type="column"/>
+      </w:r>
+    </w:p>
+    <w:p>
+      <w:pPr>
+        <w:pStyle w:val="Author"/>
+        <w:spacing w:before="0"/>
+        <w:jc w:val="center"/>
+      </w:pPr>
+      <w:r>
+        <w:rPr>
+          <w:b/>
+        </w:rPr>
+        <w:t>Yurii Parzhyn</w:t>
+        <w:br/>
+      </w:r>
+      <w:r>
+        <w:t>School of Computer and Cyber Sciences</w:t>
+        <w:br/>
+      </w:r>
+      <w:r>
+        <w:t>Augusta University</w:t>
+        <w:br/>
+      </w:r>
+      <w:r>
+        <w:t>Augusta, GA, USA</w:t>
+        <w:br/>
+      </w:r>
+      <w:r>
+        <w:t>yparzhyn@augusta.edu</w:t>
+      </w:r>
+    </w:p>
+    <w:p>
+      <w:pPr>
+        <w:sectPr>
+          <w:type w:val="continuous"/>
+          <w:pgSz w:w="11906" w:h="16838" w:code="9"/>
+          <w:pgMar w:top="450" w:right="893" w:bottom="1440" w:left="893" w:header="720" w:footer="720" w:gutter="0"/>
+          <w:cols w:space="720" w:num="3" w:equalWidth="1"/>
+          <w:docGrid w:linePitch="360"/>
+        </w:sectPr>
+      </w:pPr>
+    </w:p>
+    <w:p>
+      <w:pPr>
+        <w:pStyle w:val="Author"/>
+        <w:spacing w:before="0"/>
+        <w:jc w:val="center"/>
+      </w:pPr>
+      <w:r>
+        <w:rPr>
+          <w:b/>
+        </w:rPr>
+        <w:t>Kyrylo Perevoznyk</w:t>
+        <w:br/>
+      </w:r>
+      <w:r>
+        <w:t>Dept. of Systems Analysis and Information-Analytical Technologies</w:t>
+        <w:br/>
+      </w:r>
+      <w:r>
+        <w:t>National Technical University "Kharkiv Polytechnic Institute"</w:t>
+        <w:br/>
+      </w:r>
+      <w:r>
+        <w:t>Kharkiv, Ukraine</w:t>
+        <w:br/>
+      </w:r>
+      <w:r>
+        <w:t>kyrylo.perevoznyk@cs.khpi.edu.ua</w:t>
+      </w:r>
+      <w:r>
+        <w:br w:type="column"/>
+      </w:r>
+    </w:p>
+    <w:p>
+      <w:pPr>
+        <w:pStyle w:val="Author"/>
+        <w:spacing w:before="0"/>
+        <w:jc w:val="center"/>
+      </w:pPr>
+      <w:r>
+        <w:rPr>
+          <w:b/>
+        </w:rPr>
+        <w:t>Tetiana Aleksandrova</w:t>
+        <w:br/>
+      </w:r>
+      <w:r>
+        <w:t>Dept. of Systems Analysis and Information-Analytical Technologies</w:t>
+        <w:br/>
+      </w:r>
+      <w:r>
+        <w:t>National Technical University "Kharkiv Polytechnic Institute"</w:t>
+        <w:br/>
+      </w:r>
+      <w:r>
+        <w:t>Kharkiv, Ukraine</w:t>
+        <w:br/>
+      </w:r>
+      <w:r>
+        <w:t>Tetiana.Aleksandrova@khpi.edu.ua</w:t>
+      </w:r>
+      <w:r>
+        <w:br w:type="column"/>
+      </w:r>
+    </w:p>
+    <w:p>
+      <w:pPr>
+        <w:sectPr>
+          <w:type w:val="continuous"/>
+          <w:pgSz w:w="11906" w:h="16838" w:code="9"/>
+          <w:pgMar w:top="450" w:right="893" w:bottom="1440" w:left="893" w:header="720" w:footer="720" w:gutter="0"/>
+          <w:cols w:space="720" w:num="3" w:equalWidth="1"/>
+          <w:docGrid w:linePitch="360"/>
+        </w:sectPr>
+      </w:pPr>
+    </w:p>
     <w:p>
       <w:pPr>
         <w:pStyle w:val="Abstract"/>
@@ -246,254 +235,243 @@
     </w:p>
     <w:p>
       <w:pPr>
+        <w:pStyle w:val="1"/>
+      </w:pPr>
+      <w:r>
+        <w:t>Introduction</w:t>
+      </w:r>
+    </w:p>
+    <w:p>
+      <w:pPr>
+        <w:pStyle w:val="a3"/>
+      </w:pPr>
+      <w:r>
+        <w:t>Modern perception systems achieve impressive accuracy yet often operate as opaque pipelines, making it difficult for practitioners to understand why a particular decision was reached or where evidence resides in the input. Post-hoc explanation techniques can be helpful, but they typically project reasoning onto models that were not designed to be interpretable, yielding artifacts that are hard to validate or reuse across tasks. Modern post-hoc explanation methods such as LIME and SHAP can be adversarially manipulated or yield inconsistent attributions [1], [2], [3]. Knowledge-graph-based approaches demonstrate that explicit graph structures improve interpretability over opaque weight matrices [4]. This gap undermines trust, slows diagnosis when things fail, and complicates compliance in domains that require traceable decision paths. To tackle these challenges, we propose elevating human-readable internal structure to a core design principle from the outset.</w:t>
+      </w:r>
+    </w:p>
+    <w:p>
+      <w:pPr>
+        <w:pStyle w:val="a3"/>
+      </w:pPr>
+      <w:r>
+        <w:t>Our main idea is to make the structure the carrier of explanations. To move beyond the reliance on primarily latent vectors — whose semantics remain implicit and largely uninterpretable — we propose encoding visual information using explicit, human-intuitive structures. Specifically, we use graphs whose semantics are transparent and readily comprehensible. For 2D images, contours offer a compact, model-agnostic shape description: endpoints, corners, and junctions delineate where curves terminate or intersect, while line segments define the connections between them. We represent this structure as a graph where both these critical points and the lines are nodes, with edges capturing their spatial adjacency. This design makes line segments first-class queryable entities rather than mere connectivity markers. Attributes and tags are stored directly in the graph elements to preserve meaning inside the representation: node types (labels) mark structural roles (e.g. Point, Line), other features capture orientation and position, and connectivity patterns reveal topological properties. Explanations become navigable objects: cycles justify closed contours, node degree reveals branching structure, and attribute ranges encode acceptable variation.</w:t>
+      </w:r>
+    </w:p>
+    <w:p>
+      <w:pPr>
+        <w:pStyle w:val="a3"/>
+      </w:pPr>
+      <w:r>
+        <w:t>The goal of this paper is therefore modest and focused: we show how contours can be encoded as attributed graphs that remain readable to both humans and machines, and we demonstrate how multiple graphs of the same class can be reduced to form concept attractors — stable canonical structures suitable for classification. We present the method at a high level, emphasizing what is represented rather than prescribing specific extraction algorithms. Concretely, we (i) define a minimal vocabulary of node/edge types and attributes; (ii) describe normalization choices that make the representation invariant to scale and translation; and (iii) outline how structural reduction rules iteratively merge training samples into generalized concepts that preserve shared topology while abstracting parametric variation. We validate the approach on MNIST handwritten digits, demonstrating that concepts formed from 2–6 training samples per concept enable competitive few-shot classification through graph matching.</w:t>
+      </w:r>
+    </w:p>
+    <w:p>
+      <w:pPr>
+        <w:pStyle w:val="1"/>
+      </w:pPr>
+      <w:r>
+        <w:t>Background and Related Work</w:t>
+      </w:r>
+    </w:p>
+    <w:p>
+      <w:pPr>
+        <w:pStyle w:val="a3"/>
+      </w:pPr>
+      <w:r>
+        <w:t>Current approaches to explainable AI (XAI) predominantly rely on post-hoc techniques such as LIME and SHAP that attempt to reverse-engineer already-trained model behavior [1], [5]. However, recent work has exposed fundamental vulnerabilities: Slack et al. [2] demonstrated that both methods can be adversarially manipulated to hide discriminatory behavior, while others have documented high sensitivity to hyperparameters and feature collinearity [3]. A fundamental challenge with post-hoc explanations is that, because they are generated after the model has been trained, it is inherently difficult to corroborate them against the model's actual reasoning process.</w:t>
+      </w:r>
+    </w:p>
+    <w:p>
+      <w:pPr>
+        <w:pStyle w:val="a3"/>
+      </w:pPr>
+      <w:r>
+        <w:t>Graph-based representations offer an alternative paradigm where structure itself carries semantic information. Vision GNNs treat images as graphs with content-based connectivity, enabling interpretable visual reasoning [6], while structured shape representations (contours and skeletons) have long been studied for capturing boundaries and topological structure [7], [8]. Evidence from graph-based contour representations [9] and from alternative vectorization techniques [10] further supports encoding visual patterns using explicit structural primitives. Graph edit distance (GED) provides a principled measure for comparing such representations through edit operations, and recent hybrid approaches combine GED with learned embeddings to achieve both efficiency and interpretability [11], [12]. Few-shot learning addresses concept formation from minimal data, typically through meta-learning frameworks that learn to adapt quickly across tasks [13], [14]. Neuro-symbolic AI extends this by integrating explicit knowledge graphs and symbolic reasoning with learned representations, providing introspectable decision paths [15], [4].</w:t>
+      </w:r>
+    </w:p>
+    <w:p>
+      <w:pPr>
+        <w:pStyle w:val="a3"/>
+      </w:pPr>
+      <w:r>
+        <w:t>Despite these advances, no existing approach combines structural explainability with few-shot capability through graph-based concept formation. Post-hoc methods remain disconnected from the learning process, while graph neural networks and few-shot learners rely on opaque learned weights rather than explicit structural attractors. Taken together, energy-based neural network formulations [16] and principles of information representation [17] provide the theoretical foundation for concept formation achieved through structural reduction. The present work addresses this by encoding visual patterns directly as attributed contour graphs and forming concepts through iterative structural reduction to stable attractors, making structure — not weights — the primary carrier of both representation and explanation.</w:t>
+      </w:r>
+    </w:p>
+    <w:p>
+      <w:pPr>
+        <w:pStyle w:val="1"/>
+      </w:pPr>
+      <w:r>
+        <w:t>Graph Representation</w:t>
+      </w:r>
+    </w:p>
+    <w:p>
+      <w:pPr>
+        <w:pStyle w:val="2"/>
+      </w:pPr>
+      <w:r>
+        <w:t>Node Types and Bipartite Structure</w:t>
+      </w:r>
+    </w:p>
+    <w:p>
+      <w:pPr>
+        <w:pStyle w:val="a3"/>
+      </w:pPr>
+      <w:r>
+        <w:t>The system represents image contours as bipartite graphs alternating between Point nodes and Line nodes. It is important that line segments are represented as first-class nodes rather than edges, allowing them to have attributes such as length, direction, and orientation. Point nodes and Line nodes connect via bidirectional CONNECTED_TO relationships, creating a traversal pattern of the form Point → Line → Point → Line.</w:t>
+      </w:r>
+    </w:p>
+    <w:p>
+      <w:pPr>
+        <w:pStyle w:val="a3"/>
+      </w:pPr>
+      <w:r>
+        <w:t>Point nodes are classified into four topological types: EndPoint (terminal nodes of open contours), CornerPoint (nodes marking sharp directional changes, storing an angle attribute), IntersectionPoint (nodes where multiple segments meet), and StartPoint (anchor nodes for graph traversal). Each node carries multiple labels (e.g. ["Point", "CornerPoint"]), enabling both type-specific queries and generic structural operations. This bipartite design separates topological structure (points) from geometric properties (line segments), facilitating explicit feature extraction and structural comparison.</w:t>
+      </w:r>
+    </w:p>
+    <w:p>
+      <w:pPr>
+        <w:pStyle w:val="2"/>
+      </w:pPr>
+      <w:r>
+        <w:t>Attributes and Normalization</w:t>
+      </w:r>
+    </w:p>
+    <w:p>
+      <w:pPr>
+        <w:pStyle w:val="a3"/>
+      </w:pPr>
+      <w:r>
+        <w:t>Each node type carries attributes that encode geometric, directional, and topological properties. Point nodes store (x, y) coordinates and their normalized counterparts as well as an angle value between the lines they connect. Line nodes store endpoint pairs (x_1, y_1, x_2, y_2) and a length attribute, enabling direct access to segment geometry without recomputing from connected points. Directional attributes capture spatial orientation: each Line node is assigned a quadrant (I, II, III, IV) based on the displacement vector from its start point, and carries horizontal direction (LEFT, RIGHT, NONE) and vertical direction (TOP, BOTTOM, NONE) labels that encode relative positioning.</w:t>
+      </w:r>
+    </w:p>
+    <w:p>
+      <w:pPr>
+        <w:pStyle w:val="a3"/>
+      </w:pPr>
+      <w:r>
+        <w:t>To achieve scale and translation invariance, all coordinates and distances are normalized. Point coordinates are transformed to a centered system ranging [-1, 1] via the formula normalized_x = (x - center_x) / center_x, and similarly for y. This normalization helps concept attractors remain stable when the size, position, and proportions of the image change, allowing shapes to be recognized despite variations in viewing conditions.</w:t>
+      </w:r>
+    </w:p>
+    <w:p>
+      <w:pPr>
+        <w:pStyle w:val="1"/>
+      </w:pPr>
+      <w:r>
+        <w:t>Concept Formation via Structural Reduction</w:t>
+      </w:r>
+    </w:p>
+    <w:p>
+      <w:pPr>
+        <w:pStyle w:val="2"/>
+      </w:pPr>
+      <w:r>
+        <w:t>From Multiple Graphs to Single Attractor</w:t>
+      </w:r>
+    </w:p>
+    <w:p>
+      <w:pPr>
+        <w:pStyle w:val="a3"/>
+      </w:pPr>
+      <w:r>
+        <w:t>Concept formation proceeds through iterative structural composition following principles of architectural information representation and structural reduction [17]. Given training samples G_1, G_2, …, G_n, the algorithm initializes the concept with the first graph (C_0 = G_1) and iteratively refines it through a custom reduction operation (CRO): C_{i+1} = CRO(C_i, G_{i+1}) for i = 1, 2, …, n-1. This formulation treats the first sample as a baseline that subsequent samples refine, preserving only structural elements common across all instances.</w:t>
+      </w:r>
+    </w:p>
+    <w:p>
+      <w:pPr>
+        <w:pStyle w:val="a3"/>
+      </w:pPr>
+      <w:r>
+        <w:t>The integration process for each sample follows five coordinated steps: (1) align start points across both graphs using clustering-based selection to establish consistent traversal origins; (2) apply critical point preprocessing through iterative reduction strategies to achieve structural compatibility; (3) generate synchronized traversal paths that maintain correspondence between critical points in both graphs; (4) identify common structure along matched path segments by comparing all simple paths between consecutive critical points and selecting best matches via node similarity assessment; (5) merge geometric and semantic properties using type-specific integration strategies. Each iteration produces a refined concept C_i that represents the intersection of structural patterns encountered thus far.</w:t>
+      </w:r>
+    </w:p>
+    <w:p>
+      <w:pPr>
+        <w:pStyle w:val="2"/>
+      </w:pPr>
+      <w:r>
+        <w:t>Structural Reduction Rules</w:t>
+      </w:r>
+    </w:p>
+    <w:p>
+      <w:pPr>
+        <w:pStyle w:val="a3"/>
+      </w:pPr>
+      <w:r>
+        <w:t>The custom reduction operation employs three complementary reduction strategies to align critical point structures before path-level comparison. These strategies operate within a type hierarchy where IntersectionPoint → CornerPoint → Point, with the constraint that StartPoint and EndPoint types cannot be reduced as they define structural boundaries.</w:t>
+      </w:r>
+    </w:p>
+    <w:p>
+      <w:pPr>
+        <w:pStyle w:val="a3"/>
+      </w:pPr>
+      <w:r>
+        <w:t>Endpoint removal eliminates terminal nodes that lack correspondence across samples. The algorithm computes a similarity matrix between endpoints in the concept and image graphs, removing endpoints with maximum similarity below a given threshold. When endpoint counts differ, the algorithm removes excess endpoints with the lowest maximum similarity scores. For each removed endpoint, the algorithm traverses from the terminal node toward the nearest critical point and removes the entire connecting path, eliminating sample-specific protrusions while preserving shared structural junctions.</w:t>
+      </w:r>
+    </w:p>
+    <w:p>
+      <w:pPr>
+        <w:pStyle w:val="a3"/>
+      </w:pPr>
+      <w:r>
+        <w:t>Intersection point merging consolidates junction nodes representing the same structural feature. The algorithm first applies semantic reduction: any node labeled IntersectionPoint but having degree ≤ 2 is relabeled as CornerPoint (degree 2) or EndPoint (degree 1) to maintain type-topology consistency. When intersection counts differ between graphs, the algorithm identifies excess intersections via similarity matrix comparison and removes those with lowest similarity scores. Removal proceeds by finding the path from the excess intersection to the nearest remaining critical point, removing intermediate nodes, and relinking preserved neighbors to the target junction.</w:t>
+      </w:r>
+    </w:p>
+    <w:p>
+      <w:pPr>
+        <w:pStyle w:val="a3"/>
+      </w:pPr>
+      <w:r>
+        <w:t>Path pruning normalizes segments between aligned critical points. For each pair of corresponding critical points, the algorithm identifies all simple paths connecting them and filters paths containing intermediate critical points to maintain segment isolation. It then computes node similarity matrices between all path pairs and selects the best matching pair based on average maximum similarity per node. Using the shorter path as a template, the algorithm matches nodes from the longer path via similarity scores and constructs the result path containing only matched positions.</w:t>
+      </w:r>
+    </w:p>
+    <w:p>
+      <w:pPr>
+        <w:pStyle w:val="2"/>
+      </w:pPr>
+      <w:r>
+        <w:t>Parametric Generalization</w:t>
+      </w:r>
+    </w:p>
+    <w:p>
+      <w:pPr>
+        <w:pStyle w:val="a3"/>
+      </w:pPr>
+      <w:r>
+        <w:t>While structural reduction determines which nodes and edges persist in the concept graph, parametric generalization determines how their attributes are merged. Numeric properties transform into range representations capturing central tendency and acceptable variation: for values v_1, …, v_n from n training samples, the merged property becomes {min, max, center}. Categorical properties preserve only values consistent across all samples; inconsistent categorical values are dropped from the concept. List properties (such as Neo4j labels that encode multiple type classifications per node) retain only elements present in all samples via set intersection. The resulting concept graphs encode not point estimates but distributions of acceptable values, enabling flexible matching during classification while maintaining interpretability through explicit parameter bounds.</w:t>
+      </w:r>
+    </w:p>
+    <w:p>
+      <w:pPr>
+        <w:pStyle w:val="1"/>
+      </w:pPr>
+      <w:r>
+        <w:t>Validation on MNIST Handwritten Digits</w:t>
+      </w:r>
+    </w:p>
+    <w:p>
+      <w:pPr>
+        <w:pStyle w:val="2"/>
+      </w:pPr>
+      <w:r>
+        <w:t>Experimental Setup</w:t>
+      </w:r>
+    </w:p>
+    <w:p>
+      <w:pPr>
+        <w:pStyle w:val="a3"/>
+      </w:pPr>
+      <w:r>
+        <w:t>We validate the proposed graph-based concept formation approach on the complete-structure subset of the MNIST handwritten digit dataset [18]. The experimental design emphasizes few-shot learning capability with minimal training data and interpretable graph structures, covering all 10 digit classes.</w:t>
+      </w:r>
+    </w:p>
+    <w:p>
+      <w:pPr>
         <w:sectPr>
           <w:type w:val="continuous"/>
           <w:pgSz w:w="11906" w:h="16838" w:code="9"/>
-          <w:pgMar w:top="1080" w:right="893" w:bottom="1440" w:left="893" w:header="720" w:footer="720" w:gutter="0"/>
-          <w:cols w:space="720"/>
-          <w:docGrid w:linePitch="360"/>
-        </w:sectPr>
-      </w:pPr>
-    </w:p>
-    <w:p>
-      <w:pPr>
-        <w:pStyle w:val="1"/>
-      </w:pPr>
-      <w:r>
-        <w:t>Introduction</w:t>
-      </w:r>
-    </w:p>
-    <w:p>
-      <w:pPr>
-        <w:pStyle w:val="a3"/>
-      </w:pPr>
-      <w:r>
-        <w:t>Modern perception systems achieve impressive accuracy yet often operate as opaque pipelines, making it difficult for practitioners to understand why a particular decision was reached or where evidence resides in the input. Post-hoc explanation techniques can be helpful, but they typically project reasoning onto models that were not designed to be interpretable, yielding artifacts that are hard to validate or reuse across tasks. Modern post-hoc explanation methods such as LIME and SHAP can be adversarially manipulated or yield inconsistent attributions [1], [2], [3]. Knowledge-graph-based approaches demonstrate that explicit graph structures improve interpretability over opaque weight matrices [4]. This gap undermines trust, slows diagnosis when things fail, and complicates compliance in domains that require traceable decision paths. To tackle these challenges, we propose elevating human-readable internal structure to a core design principle from the outset.</w:t>
-      </w:r>
-    </w:p>
-    <w:p>
-      <w:pPr>
-        <w:pStyle w:val="a3"/>
-      </w:pPr>
-      <w:r>
-        <w:t>Our main idea is to make the structure the carrier of explanations. To move beyond the reliance on primarily latent vectors — whose semantics remain implicit and largely uninterpretable — we propose encoding visual information using explicit, human-intuitive structures. Specifically, we use graphs whose semantics are transparent and readily comprehensible. For 2D images, contours offer a compact, model-agnostic shape description: endpoints, corners, and junctions delineate where curves terminate or intersect, while line segments define the connections between them. We represent this structure as a graph where both these critical points and the lines are nodes, with edges capturing their spatial adjacency. This design makes line segments first-class queryable entities rather than mere connectivity markers. Attributes and tags are stored directly in the graph elements to preserve meaning inside the representation: node types (labels) mark structural roles (e.g. Point, Line), other features capture orientation and position, and connectivity patterns reveal topological properties. Explanations become navigable objects: cycles justify closed contours, node degree reveals branching structure, and attribute ranges encode acceptable variation.</w:t>
-      </w:r>
-    </w:p>
-    <w:p>
-      <w:pPr>
-        <w:pStyle w:val="a3"/>
-      </w:pPr>
-      <w:r>
-        <w:t>The goal of this paper is therefore modest and focused: we show how contours can be encoded as attributed graphs that remain readable to both humans and machines, and we demonstrate how multiple graphs of the same class can be reduced to form concept attractors — stable canonical structures suitable for classification. We present the method at a high level, emphasizing what is represented rather than prescribing specific extraction algorithms. Concretely, we (i) define a minimal vocabulary of node/edge types and attributes; (ii) describe normalization choices that make the representation invariant to scale and translation; and (iii) outline how structural reduction rules iteratively merge training samples into generalized concepts that preserve shared topology while abstracting parametric variation. We validate the approach on MNIST handwritten digits, demonstrating that concepts formed from 2–6 training samples per concept enable competitive few-shot classification through graph matching.</w:t>
-      </w:r>
-    </w:p>
-    <w:p>
-      <w:pPr>
-        <w:pStyle w:val="1"/>
-      </w:pPr>
-      <w:r>
-        <w:t>Background and Related Work</w:t>
-      </w:r>
-    </w:p>
-    <w:p>
-      <w:pPr>
-        <w:pStyle w:val="a3"/>
-      </w:pPr>
-      <w:r>
-        <w:t>Current approaches to explainable AI (XAI) predominantly rely on post-hoc techniques such as LIME and SHAP that attempt to reverse-engineer already-trained model behavior [1], [5]. However, recent work has exposed fundamental vulnerabilities: Slack et al. [2] demonstrated that both methods can be adversarially manipulated to hide discriminatory behavior, while others have documented high sensitivity to hyperparameters and feature collinearity [3]. A fundamental challenge with post-hoc explanations is that, because they are generated after the model has been trained, it is inherently difficult to corroborate them against the model's actual reasoning process.</w:t>
-      </w:r>
-    </w:p>
-    <w:p>
-      <w:pPr>
-        <w:pStyle w:val="a3"/>
-      </w:pPr>
-      <w:r>
-        <w:t>Graph-based representations offer an alternative paradigm where structure itself carries semantic information. Vision GNNs treat images as graphs with content-based connectivity, enabling interpretable visual reasoning [6], while structured shape representations (contours and skeletons) have long been studied for capturing boundaries and topological structure [7], [8]. Evidence from graph-based contour representations [9] and from alternative vectorization techniques [10] further supports encoding visual patterns using explicit structural primitives. Graph edit distance (GED) provides a principled measure for comparing such representations through edit operations, and recent hybrid approaches combine GED with learned embeddings to achieve both efficiency and interpretability [11], [12]. Few-shot learning addresses concept formation from minimal data, typically through meta-learning frameworks that learn to adapt quickly across tasks [13], [14]. Neuro-symbolic AI extends this by integrating explicit knowledge graphs and symbolic reasoning with learned representations, providing introspectable decision paths [15], [4].</w:t>
-      </w:r>
-    </w:p>
-    <w:p>
-      <w:pPr>
-        <w:pStyle w:val="a3"/>
-      </w:pPr>
-      <w:r>
-        <w:t>Despite these advances, no existing approach combines structural explainability with few-shot capability through graph-based concept formation. Post-hoc methods remain disconnected from the learning process, while graph neural networks and few-shot learners rely on opaque learned weights rather than explicit structural attractors. Taken together, energy-based neural network formulations [16] and principles of information representation [17] provide the theoretical foundation for concept formation achieved through structural reduction. The present work addresses this by encoding visual patterns directly as attributed contour graphs and forming concepts through iterative structural reduction to stable attractors, making structure — not weights — the primary carrier of both representation and explanation.</w:t>
-      </w:r>
-    </w:p>
-    <w:p>
-      <w:pPr>
-        <w:pStyle w:val="1"/>
-      </w:pPr>
-      <w:r>
-        <w:t>Graph Representation</w:t>
-      </w:r>
-    </w:p>
-    <w:p>
-      <w:pPr>
-        <w:pStyle w:val="2"/>
-      </w:pPr>
-      <w:r>
-        <w:t>Node Types and Bipartite Structure</w:t>
-      </w:r>
-    </w:p>
-    <w:p>
-      <w:pPr>
-        <w:pStyle w:val="a3"/>
-      </w:pPr>
-      <w:r>
-        <w:t>The system represents image contours as bipartite graphs alternating between Point nodes and Line nodes. It is important that line segments are represented as first-class nodes rather than edges, allowing them to have attributes such as length, direction, and orientation. Point nodes and Line nodes connect via bidirectional CONNECTED_TO relationships, creating a traversal pattern of the form Point → Line → Point → Line.</w:t>
-      </w:r>
-    </w:p>
-    <w:p>
-      <w:pPr>
-        <w:pStyle w:val="a3"/>
-      </w:pPr>
-      <w:r>
-        <w:t>Point nodes are classified into four topological types: EndPoint (terminal nodes of open contours), CornerPoint (nodes marking sharp directional changes, storing an angle attribute), IntersectionPoint (nodes where multiple segments meet), and StartPoint (anchor nodes for graph traversal). Each node carries multiple labels (e.g. ["Point", "CornerPoint"]), enabling both type-specific queries and generic structural operations. This bipartite design separates topological structure (points) from geometric properties (line segments), facilitating explicit feature extraction and structural comparison.</w:t>
-      </w:r>
-    </w:p>
-    <w:p>
-      <w:pPr>
-        <w:pStyle w:val="2"/>
-      </w:pPr>
-      <w:r>
-        <w:t>Attributes and Normalization</w:t>
-      </w:r>
-    </w:p>
-    <w:p>
-      <w:pPr>
-        <w:pStyle w:val="a3"/>
-      </w:pPr>
-      <w:r>
-        <w:t>Each node type carries attributes that encode geometric, directional, and topological properties. Point nodes store (x, y) coordinates and their normalized counterparts as well as an angle value between the lines they connect. Line nodes store endpoint pairs (x_1, y_1, x_2, y_2) and a length attribute, enabling direct access to segment geometry without recomputing from connected points. Directional attributes capture spatial orientation: each Line node is assigned a quadrant (I, II, III, IV) based on the displacement vector from its start point, and carries horizontal direction (LEFT, RIGHT, NONE) and vertical direction (TOP, BOTTOM, NONE) labels that encode relative positioning.</w:t>
-      </w:r>
-    </w:p>
-    <w:p>
-      <w:pPr>
-        <w:pStyle w:val="a3"/>
-      </w:pPr>
-      <w:r>
-        <w:t>To achieve scale and translation invariance, all coordinates and distances are normalized. Point coordinates are transformed to a centered system ranging [-1, 1] via the formula normalized_x = (x - center_x) / center_x, and similarly for y. This normalization helps concept attractors remain stable when the size, position, and proportions of the image change, allowing shapes to be recognized despite variations in viewing conditions.</w:t>
-      </w:r>
-    </w:p>
-    <w:p>
-      <w:pPr>
-        <w:pStyle w:val="1"/>
-      </w:pPr>
-      <w:r>
-        <w:t>Concept Formation via Structural Reduction</w:t>
-      </w:r>
-    </w:p>
-    <w:p>
-      <w:pPr>
-        <w:pStyle w:val="2"/>
-      </w:pPr>
-      <w:r>
-        <w:t>From Multiple Graphs to Single Attractor</w:t>
-      </w:r>
-    </w:p>
-    <w:p>
-      <w:pPr>
-        <w:pStyle w:val="a3"/>
-      </w:pPr>
-      <w:r>
-        <w:t>Concept formation proceeds through iterative structural composition following principles of architectural information representation and structural reduction [17]. Given training samples G_1, G_2, …, G_n, the algorithm initializes the concept with the first graph (C_0 = G_1) and iteratively refines it through a custom reduction operation (CRO): C_{i+1} = CRO(C_i, G_{i+1}) for i = 1, 2, …, n-1. This formulation treats the first sample as a baseline that subsequent samples refine, preserving only structural elements common across all instances.</w:t>
-      </w:r>
-    </w:p>
-    <w:p>
-      <w:pPr>
-        <w:pStyle w:val="a3"/>
-      </w:pPr>
-      <w:r>
-        <w:t>The integration process for each sample follows five coordinated steps: (1) align start points across both graphs using clustering-based selection to establish consistent traversal origins; (2) apply critical point preprocessing through iterative reduction strategies to achieve structural compatibility; (3) generate synchronized traversal paths that maintain correspondence between critical points in both graphs; (4) identify common structure along matched path segments by comparing all simple paths between consecutive critical points and selecting best matches via node similarity assessment; (5) merge geometric and semantic properties using type-specific integration strategies. Each iteration produces a refined concept C_i that represents the intersection of structural patterns encountered thus far.</w:t>
-      </w:r>
-    </w:p>
-    <w:p>
-      <w:pPr>
-        <w:pStyle w:val="2"/>
-      </w:pPr>
-      <w:r>
-        <w:t>Structural Reduction Rules</w:t>
-      </w:r>
-    </w:p>
-    <w:p>
-      <w:pPr>
-        <w:pStyle w:val="a3"/>
-      </w:pPr>
-      <w:r>
-        <w:t>The custom reduction operation employs three complementary reduction strategies to align critical point structures before path-level comparison. These strategies operate within a type hierarchy where IntersectionPoint → CornerPoint → Point, with the constraint that StartPoint and EndPoint types cannot be reduced as they define structural boundaries.</w:t>
-      </w:r>
-    </w:p>
-    <w:p>
-      <w:pPr>
-        <w:pStyle w:val="a3"/>
-      </w:pPr>
-      <w:r>
-        <w:t>Endpoint removal eliminates terminal nodes that lack correspondence across samples. The algorithm computes a similarity matrix between endpoints in the concept and image graphs, removing endpoints with maximum similarity below a given threshold. When endpoint counts differ, the algorithm removes excess endpoints with the lowest maximum similarity scores. For each removed endpoint, the algorithm traverses from the terminal node toward the nearest critical point and removes the entire connecting path, eliminating sample-specific protrusions while preserving shared structural junctions.</w:t>
-      </w:r>
-    </w:p>
-    <w:p>
-      <w:pPr>
-        <w:pStyle w:val="a3"/>
-      </w:pPr>
-      <w:r>
-        <w:t>Intersection point merging consolidates junction nodes representing the same structural feature. The algorithm first applies semantic reduction: any node labeled IntersectionPoint but having degree ≤ 2 is relabeled as CornerPoint (degree 2) or EndPoint (degree 1) to maintain type-topology consistency. When intersection counts differ between graphs, the algorithm identifies excess intersections via similarity matrix comparison and removes those with lowest similarity scores. Removal proceeds by finding the path from the excess intersection to the nearest remaining critical point, removing intermediate nodes, and relinking preserved neighbors to the target junction.</w:t>
-      </w:r>
-    </w:p>
-    <w:p>
-      <w:pPr>
-        <w:pStyle w:val="a3"/>
-      </w:pPr>
-      <w:r>
-        <w:t>Path pruning normalizes segments between aligned critical points. For each pair of corresponding critical points, the algorithm identifies all simple paths connecting them and filters paths containing intermediate critical points to maintain segment isolation. It then computes node similarity matrices between all path pairs and selects the best matching pair based on average maximum similarity per node. Using the shorter path as a template, the algorithm matches nodes from the longer path via similarity scores and constructs the result path containing only matched positions.</w:t>
-      </w:r>
-    </w:p>
-    <w:p>
-      <w:pPr>
-        <w:pStyle w:val="2"/>
-      </w:pPr>
-      <w:r>
-        <w:t>Parametric Generalization</w:t>
-      </w:r>
-    </w:p>
-    <w:p>
-      <w:pPr>
-        <w:pStyle w:val="a3"/>
-      </w:pPr>
-      <w:r>
-        <w:t>While structural reduction determines which nodes and edges persist in the concept graph, parametric generalization determines how their attributes are merged. Numeric properties transform into range representations capturing central tendency and acceptable variation: for values v_1, …, v_n from n training samples, the merged property becomes {min, max, center}. Categorical properties preserve only values consistent across all samples; inconsistent categorical values are dropped from the concept. List properties (such as Neo4j labels that encode multiple type classifications per node) retain only elements present in all samples via set intersection. The resulting concept graphs encode not point estimates but distributions of acceptable values, enabling flexible matching during classification while maintaining interpretability through explicit parameter bounds.</w:t>
-      </w:r>
-    </w:p>
-    <w:p>
-      <w:pPr>
-        <w:pStyle w:val="1"/>
-      </w:pPr>
-      <w:r>
-        <w:t>Validation on MNIST Handwritten Digits</w:t>
-      </w:r>
-    </w:p>
-    <w:p>
-      <w:pPr>
-        <w:pStyle w:val="2"/>
-      </w:pPr>
-      <w:r>
-        <w:t>Experimental Setup</w:t>
-      </w:r>
-    </w:p>
-    <w:p>
-      <w:pPr>
-        <w:pStyle w:val="a3"/>
-      </w:pPr>
-      <w:r>
-        <w:t>We validate the proposed graph-based concept formation approach on the complete-structure subset of the MNIST handwritten digit dataset [18]. The experimental design emphasizes few-shot learning capability with minimal training data and interpretable graph structures, covering all 10 digit classes.</w:t>
-      </w:r>
-    </w:p>
-    <w:p>
-      <w:pPr>
-        <w:sectPr>
-          <w:type w:val="continuous"/>
-          <w:pgSz w:w="11906" w:h="16838" w:code="9"/>
-          <w:pgMar w:top="1080" w:right="893" w:bottom="1440" w:left="893" w:header="720" w:footer="720" w:gutter="0"/>
-          <w:cols w:space="425" w:num="2" w:equalWidth="1"/>
+          <w:pgMar w:top="1080" w:right="907" w:bottom="1440" w:left="907" w:header="720" w:footer="1181" w:gutter="0"/>
+          <w:cols w:space="360" w:num="2" w:equalWidth="1"/>
           <w:docGrid w:linePitch="360"/>
         </w:sectPr>
       </w:pPr>
@@ -513,13 +491,13 @@
         <w:tblLook w:firstColumn="1" w:firstRow="1" w:lastColumn="0" w:lastRow="0" w:noHBand="0" w:noVBand="1" w:val="04A0"/>
       </w:tblPr>
       <w:tblGrid>
-        <w:gridCol w:w="5060"/>
-        <w:gridCol w:w="5060"/>
+        <w:gridCol w:w="5046"/>
+        <w:gridCol w:w="5046"/>
       </w:tblGrid>
       <w:tr>
         <w:tc>
           <w:tcPr>
-            <w:tcW w:type="dxa" w:w="5060"/>
+            <w:tcW w:type="dxa" w:w="5046"/>
           </w:tcPr>
           <w:p>
             <w:r>
@@ -533,7 +511,7 @@
         </w:tc>
         <w:tc>
           <w:tcPr>
-            <w:tcW w:type="dxa" w:w="5060"/>
+            <w:tcW w:type="dxa" w:w="5046"/>
           </w:tcPr>
           <w:p>
             <w:r>
@@ -549,7 +527,7 @@
       <w:tr>
         <w:tc>
           <w:tcPr>
-            <w:tcW w:type="dxa" w:w="5060"/>
+            <w:tcW w:type="dxa" w:w="5046"/>
           </w:tcPr>
           <w:p>
             <w:r>
@@ -562,7 +540,7 @@
         </w:tc>
         <w:tc>
           <w:tcPr>
-            <w:tcW w:type="dxa" w:w="5060"/>
+            <w:tcW w:type="dxa" w:w="5046"/>
           </w:tcPr>
           <w:p>
             <w:r>
@@ -577,7 +555,7 @@
       <w:tr>
         <w:tc>
           <w:tcPr>
-            <w:tcW w:type="dxa" w:w="5060"/>
+            <w:tcW w:type="dxa" w:w="5046"/>
           </w:tcPr>
           <w:p>
             <w:r>
@@ -590,7 +568,7 @@
         </w:tc>
         <w:tc>
           <w:tcPr>
-            <w:tcW w:type="dxa" w:w="5060"/>
+            <w:tcW w:type="dxa" w:w="5046"/>
           </w:tcPr>
           <w:p>
             <w:r>
@@ -605,7 +583,7 @@
       <w:tr>
         <w:tc>
           <w:tcPr>
-            <w:tcW w:type="dxa" w:w="5060"/>
+            <w:tcW w:type="dxa" w:w="5046"/>
           </w:tcPr>
           <w:p>
             <w:r>
@@ -618,7 +596,7 @@
         </w:tc>
         <w:tc>
           <w:tcPr>
-            <w:tcW w:type="dxa" w:w="5060"/>
+            <w:tcW w:type="dxa" w:w="5046"/>
           </w:tcPr>
           <w:p>
             <w:r>
@@ -633,7 +611,7 @@
       <w:tr>
         <w:tc>
           <w:tcPr>
-            <w:tcW w:type="dxa" w:w="5060"/>
+            <w:tcW w:type="dxa" w:w="5046"/>
           </w:tcPr>
           <w:p>
             <w:r>
@@ -646,7 +624,7 @@
         </w:tc>
         <w:tc>
           <w:tcPr>
-            <w:tcW w:type="dxa" w:w="5060"/>
+            <w:tcW w:type="dxa" w:w="5046"/>
           </w:tcPr>
           <w:p>
             <w:r>
@@ -661,7 +639,7 @@
       <w:tr>
         <w:tc>
           <w:tcPr>
-            <w:tcW w:type="dxa" w:w="5060"/>
+            <w:tcW w:type="dxa" w:w="5046"/>
           </w:tcPr>
           <w:p>
             <w:r>
@@ -674,7 +652,7 @@
         </w:tc>
         <w:tc>
           <w:tcPr>
-            <w:tcW w:type="dxa" w:w="5060"/>
+            <w:tcW w:type="dxa" w:w="5046"/>
           </w:tcPr>
           <w:p>
             <w:r>
@@ -689,7 +667,7 @@
       <w:tr>
         <w:tc>
           <w:tcPr>
-            <w:tcW w:type="dxa" w:w="5060"/>
+            <w:tcW w:type="dxa" w:w="5046"/>
           </w:tcPr>
           <w:p>
             <w:r>
@@ -702,7 +680,7 @@
         </w:tc>
         <w:tc>
           <w:tcPr>
-            <w:tcW w:type="dxa" w:w="5060"/>
+            <w:tcW w:type="dxa" w:w="5046"/>
           </w:tcPr>
           <w:p>
             <w:r>
@@ -717,7 +695,7 @@
       <w:tr>
         <w:tc>
           <w:tcPr>
-            <w:tcW w:type="dxa" w:w="5060"/>
+            <w:tcW w:type="dxa" w:w="5046"/>
           </w:tcPr>
           <w:p>
             <w:r>
@@ -730,7 +708,7 @@
         </w:tc>
         <w:tc>
           <w:tcPr>
-            <w:tcW w:type="dxa" w:w="5060"/>
+            <w:tcW w:type="dxa" w:w="5046"/>
           </w:tcPr>
           <w:p>
             <w:r>
@@ -745,7 +723,7 @@
       <w:tr>
         <w:tc>
           <w:tcPr>
-            <w:tcW w:type="dxa" w:w="5060"/>
+            <w:tcW w:type="dxa" w:w="5046"/>
           </w:tcPr>
           <w:p>
             <w:r>
@@ -758,7 +736,7 @@
         </w:tc>
         <w:tc>
           <w:tcPr>
-            <w:tcW w:type="dxa" w:w="5060"/>
+            <w:tcW w:type="dxa" w:w="5046"/>
           </w:tcPr>
           <w:p>
             <w:r>
@@ -773,7 +751,7 @@
       <w:tr>
         <w:tc>
           <w:tcPr>
-            <w:tcW w:type="dxa" w:w="5060"/>
+            <w:tcW w:type="dxa" w:w="5046"/>
           </w:tcPr>
           <w:p>
             <w:r>
@@ -786,7 +764,7 @@
         </w:tc>
         <w:tc>
           <w:tcPr>
-            <w:tcW w:type="dxa" w:w="5060"/>
+            <w:tcW w:type="dxa" w:w="5046"/>
           </w:tcPr>
           <w:p>
             <w:r>
@@ -801,7 +779,7 @@
       <w:tr>
         <w:tc>
           <w:tcPr>
-            <w:tcW w:type="dxa" w:w="5060"/>
+            <w:tcW w:type="dxa" w:w="5046"/>
           </w:tcPr>
           <w:p>
             <w:r>
@@ -814,7 +792,7 @@
         </w:tc>
         <w:tc>
           <w:tcPr>
-            <w:tcW w:type="dxa" w:w="5060"/>
+            <w:tcW w:type="dxa" w:w="5046"/>
           </w:tcPr>
           <w:p>
             <w:r>
@@ -829,7 +807,7 @@
       <w:tr>
         <w:tc>
           <w:tcPr>
-            <w:tcW w:type="dxa" w:w="5060"/>
+            <w:tcW w:type="dxa" w:w="5046"/>
           </w:tcPr>
           <w:p>
             <w:r>
@@ -842,7 +820,7 @@
         </w:tc>
         <w:tc>
           <w:tcPr>
-            <w:tcW w:type="dxa" w:w="5060"/>
+            <w:tcW w:type="dxa" w:w="5046"/>
           </w:tcPr>
           <w:p>
             <w:r>
@@ -860,8 +838,8 @@
         <w:sectPr>
           <w:type w:val="continuous"/>
           <w:pgSz w:w="11906" w:h="16838" w:code="9"/>
-          <w:pgMar w:top="1080" w:right="893" w:bottom="1440" w:left="893" w:header="720" w:footer="720" w:gutter="0"/>
-          <w:cols w:space="425" w:num="1" w:equalWidth="1"/>
+          <w:pgMar w:top="1080" w:right="907" w:bottom="1440" w:left="907" w:header="720" w:footer="1181" w:gutter="0"/>
+          <w:cols w:space="720"/>
           <w:docGrid w:linePitch="360"/>
         </w:sectPr>
       </w:pPr>
@@ -935,8 +913,8 @@
         <w:sectPr>
           <w:type w:val="continuous"/>
           <w:pgSz w:w="11906" w:h="16838" w:code="9"/>
-          <w:pgMar w:top="1080" w:right="893" w:bottom="1440" w:left="893" w:header="720" w:footer="720" w:gutter="0"/>
-          <w:cols w:space="425" w:num="2" w:equalWidth="1"/>
+          <w:pgMar w:top="1080" w:right="907" w:bottom="1440" w:left="907" w:header="720" w:footer="1181" w:gutter="0"/>
+          <w:cols w:space="360" w:num="2" w:equalWidth="1"/>
           <w:docGrid w:linePitch="360"/>
         </w:sectPr>
       </w:pPr>
@@ -956,13 +934,13 @@
         <w:tblLook w:firstColumn="1" w:firstRow="1" w:lastColumn="0" w:lastRow="0" w:noHBand="0" w:noVBand="1" w:val="04A0"/>
       </w:tblPr>
       <w:tblGrid>
-        <w:gridCol w:w="5060"/>
-        <w:gridCol w:w="5060"/>
+        <w:gridCol w:w="5046"/>
+        <w:gridCol w:w="5046"/>
       </w:tblGrid>
       <w:tr>
         <w:tc>
           <w:tcPr>
-            <w:tcW w:type="dxa" w:w="5060"/>
+            <w:tcW w:type="dxa" w:w="5046"/>
           </w:tcPr>
           <w:p>
             <w:r>
@@ -976,7 +954,7 @@
         </w:tc>
         <w:tc>
           <w:tcPr>
-            <w:tcW w:type="dxa" w:w="5060"/>
+            <w:tcW w:type="dxa" w:w="5046"/>
           </w:tcPr>
           <w:p>
             <w:r>
@@ -992,7 +970,7 @@
       <w:tr>
         <w:tc>
           <w:tcPr>
-            <w:tcW w:type="dxa" w:w="5060"/>
+            <w:tcW w:type="dxa" w:w="5046"/>
           </w:tcPr>
           <w:p>
             <w:r>
@@ -1005,7 +983,7 @@
         </w:tc>
         <w:tc>
           <w:tcPr>
-            <w:tcW w:type="dxa" w:w="5060"/>
+            <w:tcW w:type="dxa" w:w="5046"/>
           </w:tcPr>
           <w:p>
             <w:r>
@@ -1020,7 +998,7 @@
       <w:tr>
         <w:tc>
           <w:tcPr>
-            <w:tcW w:type="dxa" w:w="5060"/>
+            <w:tcW w:type="dxa" w:w="5046"/>
           </w:tcPr>
           <w:p>
             <w:r>
@@ -1033,7 +1011,7 @@
         </w:tc>
         <w:tc>
           <w:tcPr>
-            <w:tcW w:type="dxa" w:w="5060"/>
+            <w:tcW w:type="dxa" w:w="5046"/>
           </w:tcPr>
           <w:p>
             <w:r>
@@ -1048,7 +1026,7 @@
       <w:tr>
         <w:tc>
           <w:tcPr>
-            <w:tcW w:type="dxa" w:w="5060"/>
+            <w:tcW w:type="dxa" w:w="5046"/>
           </w:tcPr>
           <w:p>
             <w:r>
@@ -1061,7 +1039,7 @@
         </w:tc>
         <w:tc>
           <w:tcPr>
-            <w:tcW w:type="dxa" w:w="5060"/>
+            <w:tcW w:type="dxa" w:w="5046"/>
           </w:tcPr>
           <w:p>
             <w:r>
@@ -1076,7 +1054,7 @@
       <w:tr>
         <w:tc>
           <w:tcPr>
-            <w:tcW w:type="dxa" w:w="5060"/>
+            <w:tcW w:type="dxa" w:w="5046"/>
           </w:tcPr>
           <w:p>
             <w:r>
@@ -1089,7 +1067,7 @@
         </w:tc>
         <w:tc>
           <w:tcPr>
-            <w:tcW w:type="dxa" w:w="5060"/>
+            <w:tcW w:type="dxa" w:w="5046"/>
           </w:tcPr>
           <w:p>
             <w:r>
@@ -1107,8 +1085,8 @@
         <w:sectPr>
           <w:type w:val="continuous"/>
           <w:pgSz w:w="11906" w:h="16838" w:code="9"/>
-          <w:pgMar w:top="1080" w:right="893" w:bottom="1440" w:left="893" w:header="720" w:footer="720" w:gutter="0"/>
-          <w:cols w:space="425" w:num="1" w:equalWidth="1"/>
+          <w:pgMar w:top="1080" w:right="907" w:bottom="1440" w:left="907" w:header="720" w:footer="1181" w:gutter="0"/>
+          <w:cols w:space="720"/>
           <w:docGrid w:linePitch="360"/>
         </w:sectPr>
       </w:pPr>
@@ -1118,8 +1096,8 @@
         <w:sectPr>
           <w:type w:val="continuous"/>
           <w:pgSz w:w="11906" w:h="16838" w:code="9"/>
-          <w:pgMar w:top="1080" w:right="893" w:bottom="1440" w:left="893" w:header="720" w:footer="720" w:gutter="0"/>
-          <w:cols w:space="425" w:num="2" w:equalWidth="1"/>
+          <w:pgMar w:top="1080" w:right="907" w:bottom="1440" w:left="907" w:header="720" w:footer="1181" w:gutter="0"/>
+          <w:cols w:space="360" w:num="2" w:equalWidth="1"/>
           <w:docGrid w:linePitch="360"/>
         </w:sectPr>
       </w:pPr>
@@ -1139,15 +1117,15 @@
         <w:tblLook w:firstColumn="1" w:firstRow="1" w:lastColumn="0" w:lastRow="0" w:noHBand="0" w:noVBand="1" w:val="04A0"/>
       </w:tblPr>
       <w:tblGrid>
-        <w:gridCol w:w="2530"/>
-        <w:gridCol w:w="2530"/>
-        <w:gridCol w:w="2530"/>
-        <w:gridCol w:w="2530"/>
+        <w:gridCol w:w="2523"/>
+        <w:gridCol w:w="2523"/>
+        <w:gridCol w:w="2523"/>
+        <w:gridCol w:w="2523"/>
       </w:tblGrid>
       <w:tr>
         <w:tc>
           <w:tcPr>
-            <w:tcW w:type="dxa" w:w="2530"/>
+            <w:tcW w:type="dxa" w:w="2523"/>
           </w:tcPr>
           <w:p>
             <w:r>
@@ -1161,7 +1139,7 @@
         </w:tc>
         <w:tc>
           <w:tcPr>
-            <w:tcW w:type="dxa" w:w="2530"/>
+            <w:tcW w:type="dxa" w:w="2523"/>
           </w:tcPr>
           <w:p>
             <w:r>
@@ -1175,7 +1153,7 @@
         </w:tc>
         <w:tc>
           <w:tcPr>
-            <w:tcW w:type="dxa" w:w="2530"/>
+            <w:tcW w:type="dxa" w:w="2523"/>
           </w:tcPr>
           <w:p>
             <w:r>
@@ -1189,7 +1167,7 @@
         </w:tc>
         <w:tc>
           <w:tcPr>
-            <w:tcW w:type="dxa" w:w="2530"/>
+            <w:tcW w:type="dxa" w:w="2523"/>
           </w:tcPr>
           <w:p>
             <w:r>
@@ -1205,7 +1183,7 @@
       <w:tr>
         <w:tc>
           <w:tcPr>
-            <w:tcW w:type="dxa" w:w="2530"/>
+            <w:tcW w:type="dxa" w:w="2523"/>
           </w:tcPr>
           <w:p>
             <w:r>
@@ -1218,7 +1196,7 @@
         </w:tc>
         <w:tc>
           <w:tcPr>
-            <w:tcW w:type="dxa" w:w="2530"/>
+            <w:tcW w:type="dxa" w:w="2523"/>
           </w:tcPr>
           <w:p>
             <w:r>
@@ -1231,7 +1209,7 @@
         </w:tc>
         <w:tc>
           <w:tcPr>
-            <w:tcW w:type="dxa" w:w="2530"/>
+            <w:tcW w:type="dxa" w:w="2523"/>
           </w:tcPr>
           <w:p>
             <w:r>
@@ -1244,7 +1222,7 @@
         </w:tc>
         <w:tc>
           <w:tcPr>
-            <w:tcW w:type="dxa" w:w="2530"/>
+            <w:tcW w:type="dxa" w:w="2523"/>
           </w:tcPr>
           <w:p>
             <w:r>
@@ -1259,7 +1237,7 @@
       <w:tr>
         <w:tc>
           <w:tcPr>
-            <w:tcW w:type="dxa" w:w="2530"/>
+            <w:tcW w:type="dxa" w:w="2523"/>
           </w:tcPr>
           <w:p>
             <w:r>
@@ -1272,7 +1250,7 @@
         </w:tc>
         <w:tc>
           <w:tcPr>
-            <w:tcW w:type="dxa" w:w="2530"/>
+            <w:tcW w:type="dxa" w:w="2523"/>
           </w:tcPr>
           <w:p>
             <w:r>
@@ -1285,7 +1263,7 @@
         </w:tc>
         <w:tc>
           <w:tcPr>
-            <w:tcW w:type="dxa" w:w="2530"/>
+            <w:tcW w:type="dxa" w:w="2523"/>
           </w:tcPr>
           <w:p>
             <w:r>
@@ -1298,7 +1276,7 @@
         </w:tc>
         <w:tc>
           <w:tcPr>
-            <w:tcW w:type="dxa" w:w="2530"/>
+            <w:tcW w:type="dxa" w:w="2523"/>
           </w:tcPr>
           <w:p>
             <w:r>
@@ -1313,7 +1291,7 @@
       <w:tr>
         <w:tc>
           <w:tcPr>
-            <w:tcW w:type="dxa" w:w="2530"/>
+            <w:tcW w:type="dxa" w:w="2523"/>
           </w:tcPr>
           <w:p>
             <w:r>
@@ -1326,7 +1304,7 @@
         </w:tc>
         <w:tc>
           <w:tcPr>
-            <w:tcW w:type="dxa" w:w="2530"/>
+            <w:tcW w:type="dxa" w:w="2523"/>
           </w:tcPr>
           <w:p>
             <w:r>
@@ -1339,7 +1317,7 @@
         </w:tc>
         <w:tc>
           <w:tcPr>
-            <w:tcW w:type="dxa" w:w="2530"/>
+            <w:tcW w:type="dxa" w:w="2523"/>
           </w:tcPr>
           <w:p>
             <w:r>
@@ -1352,7 +1330,7 @@
         </w:tc>
         <w:tc>
           <w:tcPr>
-            <w:tcW w:type="dxa" w:w="2530"/>
+            <w:tcW w:type="dxa" w:w="2523"/>
           </w:tcPr>
           <w:p>
             <w:r>
@@ -1367,7 +1345,7 @@
       <w:tr>
         <w:tc>
           <w:tcPr>
-            <w:tcW w:type="dxa" w:w="2530"/>
+            <w:tcW w:type="dxa" w:w="2523"/>
           </w:tcPr>
           <w:p>
             <w:r>
@@ -1380,7 +1358,7 @@
         </w:tc>
         <w:tc>
           <w:tcPr>
-            <w:tcW w:type="dxa" w:w="2530"/>
+            <w:tcW w:type="dxa" w:w="2523"/>
           </w:tcPr>
           <w:p>
             <w:r>
@@ -1393,7 +1371,7 @@
         </w:tc>
         <w:tc>
           <w:tcPr>
-            <w:tcW w:type="dxa" w:w="2530"/>
+            <w:tcW w:type="dxa" w:w="2523"/>
           </w:tcPr>
           <w:p>
             <w:r>
@@ -1406,7 +1384,7 @@
         </w:tc>
         <w:tc>
           <w:tcPr>
-            <w:tcW w:type="dxa" w:w="2530"/>
+            <w:tcW w:type="dxa" w:w="2523"/>
           </w:tcPr>
           <w:p>
             <w:r>
@@ -1421,7 +1399,7 @@
       <w:tr>
         <w:tc>
           <w:tcPr>
-            <w:tcW w:type="dxa" w:w="2530"/>
+            <w:tcW w:type="dxa" w:w="2523"/>
           </w:tcPr>
           <w:p>
             <w:r>
@@ -1434,7 +1412,7 @@
         </w:tc>
         <w:tc>
           <w:tcPr>
-            <w:tcW w:type="dxa" w:w="2530"/>
+            <w:tcW w:type="dxa" w:w="2523"/>
           </w:tcPr>
           <w:p>
             <w:r>
@@ -1447,7 +1425,7 @@
         </w:tc>
         <w:tc>
           <w:tcPr>
-            <w:tcW w:type="dxa" w:w="2530"/>
+            <w:tcW w:type="dxa" w:w="2523"/>
           </w:tcPr>
           <w:p>
             <w:r>
@@ -1460,7 +1438,7 @@
         </w:tc>
         <w:tc>
           <w:tcPr>
-            <w:tcW w:type="dxa" w:w="2530"/>
+            <w:tcW w:type="dxa" w:w="2523"/>
           </w:tcPr>
           <w:p>
             <w:r>
@@ -1475,7 +1453,7 @@
       <w:tr>
         <w:tc>
           <w:tcPr>
-            <w:tcW w:type="dxa" w:w="2530"/>
+            <w:tcW w:type="dxa" w:w="2523"/>
           </w:tcPr>
           <w:p>
             <w:r>
@@ -1488,7 +1466,7 @@
         </w:tc>
         <w:tc>
           <w:tcPr>
-            <w:tcW w:type="dxa" w:w="2530"/>
+            <w:tcW w:type="dxa" w:w="2523"/>
           </w:tcPr>
           <w:p>
             <w:r>
@@ -1501,7 +1479,7 @@
         </w:tc>
         <w:tc>
           <w:tcPr>
-            <w:tcW w:type="dxa" w:w="2530"/>
+            <w:tcW w:type="dxa" w:w="2523"/>
           </w:tcPr>
           <w:p>
             <w:r>
@@ -1514,7 +1492,7 @@
         </w:tc>
         <w:tc>
           <w:tcPr>
-            <w:tcW w:type="dxa" w:w="2530"/>
+            <w:tcW w:type="dxa" w:w="2523"/>
           </w:tcPr>
           <w:p>
             <w:r>
@@ -1529,7 +1507,7 @@
       <w:tr>
         <w:tc>
           <w:tcPr>
-            <w:tcW w:type="dxa" w:w="2530"/>
+            <w:tcW w:type="dxa" w:w="2523"/>
           </w:tcPr>
           <w:p>
             <w:r>
@@ -1542,7 +1520,7 @@
         </w:tc>
         <w:tc>
           <w:tcPr>
-            <w:tcW w:type="dxa" w:w="2530"/>
+            <w:tcW w:type="dxa" w:w="2523"/>
           </w:tcPr>
           <w:p>
             <w:r>
@@ -1555,7 +1533,7 @@
         </w:tc>
         <w:tc>
           <w:tcPr>
-            <w:tcW w:type="dxa" w:w="2530"/>
+            <w:tcW w:type="dxa" w:w="2523"/>
           </w:tcPr>
           <w:p>
             <w:r>
@@ -1568,7 +1546,7 @@
         </w:tc>
         <w:tc>
           <w:tcPr>
-            <w:tcW w:type="dxa" w:w="2530"/>
+            <w:tcW w:type="dxa" w:w="2523"/>
           </w:tcPr>
           <w:p>
             <w:r>
@@ -1583,7 +1561,7 @@
       <w:tr>
         <w:tc>
           <w:tcPr>
-            <w:tcW w:type="dxa" w:w="2530"/>
+            <w:tcW w:type="dxa" w:w="2523"/>
           </w:tcPr>
           <w:p>
             <w:r>
@@ -1596,7 +1574,7 @@
         </w:tc>
         <w:tc>
           <w:tcPr>
-            <w:tcW w:type="dxa" w:w="2530"/>
+            <w:tcW w:type="dxa" w:w="2523"/>
           </w:tcPr>
           <w:p>
             <w:r>
@@ -1609,7 +1587,7 @@
         </w:tc>
         <w:tc>
           <w:tcPr>
-            <w:tcW w:type="dxa" w:w="2530"/>
+            <w:tcW w:type="dxa" w:w="2523"/>
           </w:tcPr>
           <w:p>
             <w:r>
@@ -1622,7 +1600,7 @@
         </w:tc>
         <w:tc>
           <w:tcPr>
-            <w:tcW w:type="dxa" w:w="2530"/>
+            <w:tcW w:type="dxa" w:w="2523"/>
           </w:tcPr>
           <w:p>
             <w:r>
@@ -1637,7 +1615,7 @@
       <w:tr>
         <w:tc>
           <w:tcPr>
-            <w:tcW w:type="dxa" w:w="2530"/>
+            <w:tcW w:type="dxa" w:w="2523"/>
           </w:tcPr>
           <w:p>
             <w:r>
@@ -1650,7 +1628,7 @@
         </w:tc>
         <w:tc>
           <w:tcPr>
-            <w:tcW w:type="dxa" w:w="2530"/>
+            <w:tcW w:type="dxa" w:w="2523"/>
           </w:tcPr>
           <w:p>
             <w:r>
@@ -1663,7 +1641,7 @@
         </w:tc>
         <w:tc>
           <w:tcPr>
-            <w:tcW w:type="dxa" w:w="2530"/>
+            <w:tcW w:type="dxa" w:w="2523"/>
           </w:tcPr>
           <w:p>
             <w:r>
@@ -1676,7 +1654,7 @@
         </w:tc>
         <w:tc>
           <w:tcPr>
-            <w:tcW w:type="dxa" w:w="2530"/>
+            <w:tcW w:type="dxa" w:w="2523"/>
           </w:tcPr>
           <w:p>
             <w:r>
@@ -1691,7 +1669,7 @@
       <w:tr>
         <w:tc>
           <w:tcPr>
-            <w:tcW w:type="dxa" w:w="2530"/>
+            <w:tcW w:type="dxa" w:w="2523"/>
           </w:tcPr>
           <w:p>
             <w:r>
@@ -1704,7 +1682,7 @@
         </w:tc>
         <w:tc>
           <w:tcPr>
-            <w:tcW w:type="dxa" w:w="2530"/>
+            <w:tcW w:type="dxa" w:w="2523"/>
           </w:tcPr>
           <w:p>
             <w:r>
@@ -1717,7 +1695,7 @@
         </w:tc>
         <w:tc>
           <w:tcPr>
-            <w:tcW w:type="dxa" w:w="2530"/>
+            <w:tcW w:type="dxa" w:w="2523"/>
           </w:tcPr>
           <w:p>
             <w:r>
@@ -1730,7 +1708,7 @@
         </w:tc>
         <w:tc>
           <w:tcPr>
-            <w:tcW w:type="dxa" w:w="2530"/>
+            <w:tcW w:type="dxa" w:w="2523"/>
           </w:tcPr>
           <w:p>
             <w:r>
@@ -1748,8 +1726,8 @@
         <w:sectPr>
           <w:type w:val="continuous"/>
           <w:pgSz w:w="11906" w:h="16838" w:code="9"/>
-          <w:pgMar w:top="1080" w:right="893" w:bottom="1440" w:left="893" w:header="720" w:footer="720" w:gutter="0"/>
-          <w:cols w:space="425" w:num="1" w:equalWidth="1"/>
+          <w:pgMar w:top="1080" w:right="907" w:bottom="1440" w:left="907" w:header="720" w:footer="1181" w:gutter="0"/>
+          <w:cols w:space="720"/>
           <w:docGrid w:linePitch="360"/>
         </w:sectPr>
       </w:pPr>
@@ -1774,7 +1752,7 @@
                     <pic:cNvPicPr/>
                   </pic:nvPicPr>
                   <pic:blipFill>
-                    <a:blip r:embed="rId17"/>
+                    <a:blip r:embed="rId19"/>
                     <a:stretch>
                       <a:fillRect/>
                     </a:stretch>
@@ -1883,125 +1861,161 @@
     </w:p>
     <w:p>
       <w:pPr>
-        <w:pStyle w:val="1"/>
+        <w:pStyle w:val="5"/>
       </w:pPr>
       <w:r>
         <w:t>References</w:t>
       </w:r>
     </w:p>
     <w:p>
-      <w:pPr/>
-      <w:r>
-        <w:t>[1] M. T. Ribeiro, S. Singh, and C. Guestrin, "‘Why should I trust you?’: Explaining the predictions of any classifier," in Proc. 22nd ACM SIGKDD Int. Conf. Knowledge Discovery and Data Mining, 2016, pp. 1135–1144.</w:t>
-      </w:r>
-    </w:p>
-    <w:p>
-      <w:pPr/>
-      <w:r>
-        <w:t>[2] D. Slack, S. Hilgard, E. Jia, S. Singh, and H. Lakkaraju, "Fooling LIME and SHAP: Adversarial attacks on post-hoc explanation methods," in Proc. AAAI/ACM Conf. AI, Ethics, and Society, 2020, pp. 180–186.</w:t>
-      </w:r>
-    </w:p>
-    <w:p>
-      <w:pPr/>
-      <w:r>
-        <w:t>[3] D. Hooshyar and Y. Yang, "Problems with SHAP and LIME in interpretable AI for education: A comparative study of post-hoc explanations and neural-symbolic rule extraction," IEEE Access, vol. 12, pp. 137 472–137 490, 2024.</w:t>
-      </w:r>
-    </w:p>
-    <w:p>
-      <w:pPr/>
-      <w:r>
-        <w:t>[4] E. Rajabi and K. Etminani, "Knowledge-graph-based explainable AI: A systematic review," Journal of Information Science, vol. 50, no. 4, pp. 1019–1029, 2024.</w:t>
-      </w:r>
-    </w:p>
-    <w:p>
-      <w:pPr/>
-      <w:r>
-        <w:t>[5] S. M. Lundberg and S.-I. Lee, "A unified approach to interpreting model predictions," in Advances in Neural Information Processing Systems, vol. 30, 2017, pp. 4765–4774.</w:t>
-      </w:r>
-    </w:p>
-    <w:p>
-      <w:pPr/>
-      <w:r>
-        <w:t>[6] K. Han, Y. Wang, J. Guo, Y. Tang, and E. Wu, "Vision GNN: An image is worth graph of nodes," in Advances in Neural Information Processing Systems, vol. 35, 2022, pp. 8305–8319.</w:t>
-      </w:r>
-    </w:p>
-    <w:p>
-      <w:pPr/>
-      <w:r>
-        <w:t>[7] H. Chatbri, K. Kameyama, and P. Kwan, "A comparative study using contours and skeletons as shape representations for binary image matching," Pattern Recognition Letters, vol. 76, pp. 59–66, 2016.</w:t>
-      </w:r>
-    </w:p>
-    <w:p>
-      <w:pPr/>
-      <w:r>
-        <w:t>[8] W. Shen, Y. Wang, X. Bai, H. Wang, and L. J. Zhang, "Shape recognition by bag of skeleton-associated contour parts," in Proc. IEEE Conf. Computer Vision and Pattern Recognition, 2016, pp. 2125–2133.</w:t>
-      </w:r>
-    </w:p>
-    <w:p>
-      <w:pPr/>
-      <w:r>
-        <w:t>[9] Yu. Parzhyn, "Principles of modal and vector theory of formal intelligence systems," arXiv:1302.1334, 2013.</w:t>
-      </w:r>
-    </w:p>
-    <w:p>
-      <w:pPr/>
-      <w:r>
-        <w:t>[10] Yu. Parzhyn, S. Galkyn, and M. Sobol, "Method for binary contour images vectorization of handwritten characters for recognition by detector neural networks," in 2022 IEEE 3rd KhPI Week on Advanced Technology (KhPIWeek), Kharkiv, Ukraine, 2022, pp. 1–6, doi: 10.1109/KhPIWeek57572.2022.9916331.</w:t>
-      </w:r>
-    </w:p>
-    <w:p>
-      <w:pPr/>
-      <w:r>
-        <w:t>[11] F. Wang, P. Jiang, K. Riesen, and J. Zhang, "Combinatorial learning of graph edit distance via dynamic embedding," in Proc. IEEE/CVF Conf. Computer Vision and Pattern Recognition, 2021, pp. 5184–5193.</w:t>
-      </w:r>
-    </w:p>
-    <w:p>
-      <w:pPr/>
-      <w:r>
-        <w:t>[12] C. Liu et al., "MATA: Multi-attribute time series anomaly detection via meta-learning and attentive adaptive framework," in Proc. VLDB Endowment, vol. 16, no. 12, 2023, pp. 3983–3995.</w:t>
-      </w:r>
-    </w:p>
-    <w:p>
-      <w:pPr/>
-      <w:r>
-        <w:t>[13] C. Finn, P. Abbeel, and S. Levine, "Model-agnostic meta-learning for fast adaptation of deep networks," in Proc. 34th Int. Conf. Machine Learning, 2017, pp. 1126–1135.</w:t>
-      </w:r>
-    </w:p>
-    <w:p>
-      <w:pPr/>
-      <w:r>
-        <w:t>[14] J. Snell, K. Swersky, and R. Zemel, "Prototypical networks for few-shot learning," in Advances in Neural Information Processing Systems, vol. 30, 2017, pp. 4077–4087.</w:t>
-      </w:r>
-    </w:p>
-    <w:p>
-      <w:pPr/>
-      <w:r>
-        <w:t>[15] U. Nawaz, M. Anees-ur-Rahaman, and Z. Saeed, "A review of neuro-symbolic AI integrating reasoning and learning for advanced cognitive systems," Intelligent Systems with Applications, p. 200 541, 2025.</w:t>
-      </w:r>
-    </w:p>
-    <w:p>
-      <w:pPr/>
-      <w:r>
-        <w:t>[16] Yu. Parzhyn, M. Lapin, and K. Bokhan, "A new approach to building energy models of neural networks," Advanced Information Systems, vol. 9, no. 4, pp. 100–119, 2025.</w:t>
-      </w:r>
-    </w:p>
-    <w:p>
-      <w:pPr/>
-      <w:r>
-        <w:t>[17] Yu. Parzhyn, "Architecture of information," arXiv:2503.21794, 2025, doi: 10.48550/arXiv.2503.21794.</w:t>
-      </w:r>
-    </w:p>
-    <w:p>
-      <w:pPr/>
-      <w:r>
-        <w:t>[18] Y. LeCun, L. Bottou, Y. Bengio, and P. Haffner, "Gradient-based learning applied to document recognition," Proceedings of the IEEE, vol. 86, no. 11, pp. 2278–2324, Nov. 1998.</w:t>
+      <w:pPr>
+        <w:pStyle w:val="references"/>
+      </w:pPr>
+      <w:r>
+        <w:t>M. T. Ribeiro, S. Singh, and C. Guestrin, "‘Why should I trust you?’: Explaining the predictions of any classifier," in Proc. 22nd ACM SIGKDD Int. Conf. Knowledge Discovery and Data Mining, 2016, pp. 1135–1144.</w:t>
+      </w:r>
+    </w:p>
+    <w:p>
+      <w:pPr>
+        <w:pStyle w:val="references"/>
+      </w:pPr>
+      <w:r>
+        <w:t>D. Slack, S. Hilgard, E. Jia, S. Singh, and H. Lakkaraju, "Fooling LIME and SHAP: Adversarial attacks on post-hoc explanation methods," in Proc. AAAI/ACM Conf. AI, Ethics, and Society, 2020, pp. 180–186.</w:t>
+      </w:r>
+    </w:p>
+    <w:p>
+      <w:pPr>
+        <w:pStyle w:val="references"/>
+      </w:pPr>
+      <w:r>
+        <w:t>D. Hooshyar and Y. Yang, "Problems with SHAP and LIME in interpretable AI for education: A comparative study of post-hoc explanations and neural-symbolic rule extraction," IEEE Access, vol. 12, pp. 137 472–137 490, 2024.</w:t>
+      </w:r>
+    </w:p>
+    <w:p>
+      <w:pPr>
+        <w:pStyle w:val="references"/>
+      </w:pPr>
+      <w:r>
+        <w:t>E. Rajabi and K. Etminani, "Knowledge-graph-based explainable AI: A systematic review," Journal of Information Science, vol. 50, no. 4, pp. 1019–1029, 2024.</w:t>
+      </w:r>
+    </w:p>
+    <w:p>
+      <w:pPr>
+        <w:pStyle w:val="references"/>
+      </w:pPr>
+      <w:r>
+        <w:t>S. M. Lundberg and S.-I. Lee, "A unified approach to interpreting model predictions," in Advances in Neural Information Processing Systems, vol. 30, 2017, pp. 4765–4774.</w:t>
+      </w:r>
+    </w:p>
+    <w:p>
+      <w:pPr>
+        <w:pStyle w:val="references"/>
+      </w:pPr>
+      <w:r>
+        <w:t>K. Han, Y. Wang, J. Guo, Y. Tang, and E. Wu, "Vision GNN: An image is worth graph of nodes," in Advances in Neural Information Processing Systems, vol. 35, 2022, pp. 8305–8319.</w:t>
+      </w:r>
+    </w:p>
+    <w:p>
+      <w:pPr>
+        <w:pStyle w:val="references"/>
+      </w:pPr>
+      <w:r>
+        <w:t>H. Chatbri, K. Kameyama, and P. Kwan, "A comparative study using contours and skeletons as shape representations for binary image matching," Pattern Recognition Letters, vol. 76, pp. 59–66, 2016.</w:t>
+      </w:r>
+    </w:p>
+    <w:p>
+      <w:pPr>
+        <w:pStyle w:val="references"/>
+      </w:pPr>
+      <w:r>
+        <w:t>W. Shen, Y. Wang, X. Bai, H. Wang, and L. J. Zhang, "Shape recognition by bag of skeleton-associated contour parts," in Proc. IEEE Conf. Computer Vision and Pattern Recognition, 2016, pp. 2125–2133.</w:t>
+      </w:r>
+    </w:p>
+    <w:p>
+      <w:pPr>
+        <w:pStyle w:val="references"/>
+      </w:pPr>
+      <w:r>
+        <w:t>Yu. Parzhyn, "Principles of modal and vector theory of formal intelligence systems," arXiv:1302.1334, 2013.</w:t>
+      </w:r>
+    </w:p>
+    <w:p>
+      <w:pPr>
+        <w:pStyle w:val="references"/>
+      </w:pPr>
+      <w:r>
+        <w:t>Yu. Parzhyn, S. Galkyn, and M. Sobol, "Method for binary contour images vectorization of handwritten characters for recognition by detector neural networks," in 2022 IEEE 3rd KhPI Week on Advanced Technology (KhPIWeek), Kharkiv, Ukraine, 2022, pp. 1–6, doi: 10.1109/KhPIWeek57572.2022.9916331.</w:t>
+      </w:r>
+    </w:p>
+    <w:p>
+      <w:pPr>
+        <w:pStyle w:val="references"/>
+      </w:pPr>
+      <w:r>
+        <w:t>F. Wang, P. Jiang, K. Riesen, and J. Zhang, "Combinatorial learning of graph edit distance via dynamic embedding," in Proc. IEEE/CVF Conf. Computer Vision and Pattern Recognition, 2021, pp. 5184–5193.</w:t>
+      </w:r>
+    </w:p>
+    <w:p>
+      <w:pPr>
+        <w:pStyle w:val="references"/>
+      </w:pPr>
+      <w:r>
+        <w:t>C. Liu et al., "MATA: Multi-attribute time series anomaly detection via meta-learning and attentive adaptive framework," in Proc. VLDB Endowment, vol. 16, no. 12, 2023, pp. 3983–3995.</w:t>
+      </w:r>
+    </w:p>
+    <w:p>
+      <w:pPr>
+        <w:pStyle w:val="references"/>
+      </w:pPr>
+      <w:r>
+        <w:t>C. Finn, P. Abbeel, and S. Levine, "Model-agnostic meta-learning for fast adaptation of deep networks," in Proc. 34th Int. Conf. Machine Learning, 2017, pp. 1126–1135.</w:t>
+      </w:r>
+    </w:p>
+    <w:p>
+      <w:pPr>
+        <w:pStyle w:val="references"/>
+      </w:pPr>
+      <w:r>
+        <w:t>J. Snell, K. Swersky, and R. Zemel, "Prototypical networks for few-shot learning," in Advances in Neural Information Processing Systems, vol. 30, 2017, pp. 4077–4087.</w:t>
+      </w:r>
+    </w:p>
+    <w:p>
+      <w:pPr>
+        <w:pStyle w:val="references"/>
+      </w:pPr>
+      <w:r>
+        <w:t>U. Nawaz, M. Anees-ur-Rahaman, and Z. Saeed, "A review of neuro-symbolic AI integrating reasoning and learning for advanced cognitive systems," Intelligent Systems with Applications, p. 200 541, 2025.</w:t>
+      </w:r>
+    </w:p>
+    <w:p>
+      <w:pPr>
+        <w:pStyle w:val="references"/>
+      </w:pPr>
+      <w:r>
+        <w:t>Yu. Parzhyn, M. Lapin, and K. Bokhan, "A new approach to building energy models of neural networks," Advanced Information Systems, vol. 9, no. 4, pp. 100–119, 2025.</w:t>
+      </w:r>
+    </w:p>
+    <w:p>
+      <w:pPr>
+        <w:pStyle w:val="references"/>
+      </w:pPr>
+      <w:r>
+        <w:t>Yu. Parzhyn, "Architecture of information," arXiv:2503.21794, 2025, doi: 10.48550/arXiv.2503.21794.</w:t>
+      </w:r>
+    </w:p>
+    <w:p>
+      <w:pPr>
+        <w:pStyle w:val="references"/>
+      </w:pPr>
+      <w:r>
+        <w:t>Y. LeCun, L. Bottou, Y. Bengio, and P. Haffner, "Gradient-based learning applied to document recognition," Proceedings of the IEEE, vol. 86, no. 11, pp. 2278–2324, Nov. 1998.</w:t>
       </w:r>
     </w:p>
     <w:sectPr>
       <w:type w:val="continuous"/>
       <w:pgSz w:w="11906" w:h="16838" w:code="9"/>
-      <w:pgMar w:top="1080" w:right="893" w:bottom="1440" w:left="893" w:header="720" w:footer="720" w:gutter="0"/>
-      <w:cols w:space="425" w:num="2" w:equalWidth="1"/>
+      <w:pgMar w:top="1080" w:right="907" w:bottom="1440" w:left="907" w:header="720" w:footer="1181" w:gutter="0"/>
+      <w:cols w:space="360" w:num="2" w:equalWidth="1"/>
       <w:docGrid w:linePitch="360"/>
     </w:sectPr>
   </w:body>
@@ -2042,6 +2056,20 @@
         <w:szCs w:val="18"/>
         <w:lang w:val="uk-UA"/>
       </w:rPr>
+      <w:t>979-8-3315-5236-7/26/$31.00 ©2026 IEEE</w:t>
+    </w:r>
+  </w:p>
+</w:ftr>
+</file>
+
+<file path=word/footer2.xml><?xml version="1.0" encoding="utf-8"?>
+<w:ftr xmlns:m="http://schemas.openxmlformats.org/officeDocument/2006/math" xmlns:mc="http://schemas.openxmlformats.org/markup-compatibility/2006" xmlns:mo="http://schemas.microsoft.com/office/mac/office/2008/main" xmlns:mv="urn:schemas-microsoft-com:mac:vml" xmlns:o="urn:schemas-microsoft-com:office:office" xmlns:r="http://schemas.openxmlformats.org/officeDocument/2006/relationships" xmlns:v="urn:schemas-microsoft-com:vml" xmlns:w10="urn:schemas-microsoft-com:office:word" xmlns:w14="http://schemas.microsoft.com/office/word/2010/wordml" xmlns:w="http://schemas.openxmlformats.org/wordprocessingml/2006/main" xmlns:wne="http://schemas.microsoft.com/office/word/2006/wordml" xmlns:wp14="http://schemas.microsoft.com/office/word/2010/wordprocessingDrawing" xmlns:wp="http://schemas.openxmlformats.org/drawingml/2006/wordprocessingDrawing" xmlns:wpc="http://schemas.microsoft.com/office/word/2010/wordprocessingCanvas" xmlns:wpg="http://schemas.microsoft.com/office/word/2010/wordprocessingGroup" xmlns:wpi="http://schemas.microsoft.com/office/word/2010/wordprocessingInk" xmlns:wps="http://schemas.microsoft.com/office/word/2010/wordprocessingShape" mc:Ignorable="w14 wp14">
+  <w:p>
+    <w:pPr>
+      <w:pStyle w:val="Footer"/>
+      <w:jc w:val="center"/>
+    </w:pPr>
+    <w:r>
       <w:t>979-8-3315-5236-7/26/$31.00 ©2026 IEEE</w:t>
     </w:r>
   </w:p>
@@ -2109,6 +2137,20 @@
         <w:lang w:val="uk-UA"/>
       </w:rPr>
       <w:t xml:space="preserve"> (KhPIWeek)</w:t>
+    </w:r>
+  </w:p>
+</w:hdr>
+</file>
+
+<file path=word/header2.xml><?xml version="1.0" encoding="utf-8"?>
+<w:hdr xmlns:m="http://schemas.openxmlformats.org/officeDocument/2006/math" xmlns:mc="http://schemas.openxmlformats.org/markup-compatibility/2006" xmlns:mo="http://schemas.microsoft.com/office/mac/office/2008/main" xmlns:mv="urn:schemas-microsoft-com:mac:vml" xmlns:o="urn:schemas-microsoft-com:office:office" xmlns:r="http://schemas.openxmlformats.org/officeDocument/2006/relationships" xmlns:v="urn:schemas-microsoft-com:vml" xmlns:w10="urn:schemas-microsoft-com:office:word" xmlns:w14="http://schemas.microsoft.com/office/word/2010/wordml" xmlns:w="http://schemas.openxmlformats.org/wordprocessingml/2006/main" xmlns:wne="http://schemas.microsoft.com/office/word/2006/wordml" xmlns:wp14="http://schemas.microsoft.com/office/word/2010/wordprocessingDrawing" xmlns:wp="http://schemas.openxmlformats.org/drawingml/2006/wordprocessingDrawing" xmlns:wpc="http://schemas.microsoft.com/office/word/2010/wordprocessingCanvas" xmlns:wpg="http://schemas.microsoft.com/office/word/2010/wordprocessingGroup" xmlns:wpi="http://schemas.microsoft.com/office/word/2010/wordprocessingInk" xmlns:wps="http://schemas.microsoft.com/office/word/2010/wordprocessingShape" mc:Ignorable="w14 wp14">
+  <w:p>
+    <w:pPr>
+      <w:pStyle w:val="Header"/>
+      <w:jc w:val="center"/>
+    </w:pPr>
+    <w:r>
+      <w:t>2026 IEEE 7th KhPI Week on Advanced Technology (KhPIWeek)</w:t>
     </w:r>
   </w:p>
 </w:hdr>

</xml_diff>